<commit_message>
HW1: add group member names and AI-use statement to write-up and slides
Co-Authored-By: Claude Opus 5.5 <noreply@anthropic.com>
</commit_message>
<xml_diff>
--- a/hw1/report/MGT634_HW1_NHAMCS_writeup.docx
+++ b/hw1/report/MGT634_HW1_NHAMCS_writeup.docx
@@ -25,7 +25,7 @@
           <w:color w:val="52514E"/>
           <w:sz w:val="18"/>
         </w:rPr>
-        <w:t>MGT 634 Empirical Strategy with AI · Homework 1 · Group: Michal Kozuchowski, [add teammate names] · September 2026</w:t>
+        <w:t>MGT 634 Empirical Strategy with AI · Homework 1 · Group: Michal Kozuchowski, Laila Lapins, Nick Giamalis, Raymond Chang, Sean Weller · September 2026</w:t>
       </w:r>
     </w:p>
     <w:p>
@@ -2670,6 +2670,24 @@
         <w:t xml:space="preserve"> these are weighted point estimates without survey-design standard errors (CSTRATM/CPSUM; NCHS advises testing at the 1% level). Wait-time missingness is not random. Chronic conditions such as obesity are likely under-recorded, and the 2015 form changes limit comparisons with earlier years.</w:t>
       </w:r>
     </w:p>
+    <w:p>
+      <w:r>
+        <w:rPr>
+          <w:b/>
+          <w:color w:val="52514E"/>
+          <w:sz w:val="18"/>
+        </w:rPr>
+        <w:t>AI use.</w:t>
+      </w:r>
+      <w:r>
+        <w:rPr>
+          <w:b w:val="0"/>
+          <w:color w:val="52514E"/>
+          <w:sz w:val="18"/>
+        </w:rPr>
+        <w:t xml:space="preserve"> As the course requires, we used AI throughout. The analysis code was written with Claude (Anthropic) through Claude Code, directed by the group question by question. We ran every step ourselves on the Yale HPC cluster, reviewed each output before moving on, and verified results against published NCHS figures (20 of 20 checks pass). This write-up and the slides were drafted with AI assistance from those verified outputs, then reviewed and edited by the group.</w:t>
+      </w:r>
+    </w:p>
     <w:sectPr>
       <w:pgSz w:w="12240" w:h="15840"/>
       <w:pgMar w:top="864" w:right="1080" w:bottom="864" w:left="1080" w:header="720" w:footer="720" w:gutter="0"/>

</xml_diff>

<commit_message>
HW1: revise write-up and slides after review
- Describe checks accurately: NCHS comparisons (Table 1, wait-time missingness
  15.2% vs 15.7% published) are separate from the 20-value reproducibility check
- Payer = primary expected payer, not revenue; conditional financial discussion
- Qualify intent, chronic-condition and missingness claims; triage comparisons
  descriptive only; rare deaths below NCHS 30-record threshold not broken out
- Chronic chart shows combined diabetes to match the text; layout rebalanced
- Slides refocused per review; no 20/20 card or ED-death figure

Co-Authored-By: Claude Opus 5.5 <noreply@anthropic.com>
</commit_message>
<xml_diff>
--- a/hw1/report/MGT634_HW1_NHAMCS_writeup.docx
+++ b/hw1/report/MGT634_HW1_NHAMCS_writeup.docx
@@ -25,7 +25,7 @@
           <w:color w:val="52514E"/>
           <w:sz w:val="18"/>
         </w:rPr>
-        <w:t>MGT 634 Empirical Strategy with AI · Homework 1 · Group: Michal Kozuchowski, Laila Lapins, Nick Giamalis, Raymond Chang, Sean Weller · September 2026</w:t>
+        <w:t>MGT 634 Empirical Strategy with AI · Homework 1 · Michal Kozuchowski, Laila Lapins, Nick Giamalis, Raymond Chang, Sean Weller · September 2026</w:t>
       </w:r>
     </w:p>
     <w:p>
@@ -33,49 +33,13 @@
         <w:rPr>
           <w:b/>
         </w:rPr>
-        <w:t>Bottom line.</w:t>
+        <w:t>Summary.</w:t>
       </w:r>
       <w:r>
         <w:rPr>
           <w:b w:val="0"/>
         </w:rPr>
-        <w:t xml:space="preserve"> U.S. EDs handled an estimated </w:t>
-      </w:r>
-      <w:r>
-        <w:rPr>
-          <w:b/>
-        </w:rPr>
-        <w:t>136.9 million visits</w:t>
-      </w:r>
-      <w:r>
-        <w:rPr>
-          <w:b w:val="0"/>
-        </w:rPr>
-        <w:t xml:space="preserve"> in 2015. Demand is predictable: it plateaus from 10am to 8pm and is highest on Mondays. Payment is dominated by public payers (</w:t>
-      </w:r>
-      <w:r>
-        <w:rPr>
-          <w:b/>
-        </w:rPr>
-        <w:t>Medicaid 34.9%, Medicare 19.9%</w:t>
-      </w:r>
-      <w:r>
-        <w:rPr>
-          <w:b w:val="0"/>
-        </w:rPr>
-        <w:t xml:space="preserve"> of visits with a known payer), and </w:t>
-      </w:r>
-      <w:r>
-        <w:rPr>
-          <w:b/>
-        </w:rPr>
-        <w:t>nearly half of visits (47.6%)</w:t>
-      </w:r>
-      <w:r>
-        <w:rPr>
-          <w:b w:val="0"/>
-        </w:rPr>
-        <w:t xml:space="preserve"> involve a chronic condition. Triage sorts patients sharply by outcome (a third of the most urgent are admitted vs 2-3% of the least urgent), but median waits are almost identical (18-20 minutes) for every level except the most urgent.</w:t>
+        <w:t xml:space="preserve"> Weighted to the national level, the 2015 NHAMCS emergency department sample represents about 136.9 million U.S. ED visits. Arrivals follow a stable daily pattern: they rise from 7am, stay near their peak from 10am to 8pm, and are heaviest on Mondays. The median visit lasts about two and a half hours, so time in the department matters for crowding as much as arrival volume. Medicaid is the most common expected payer, and nearly half of visits with a completed chronic-condition section record at least one chronic condition. Triage level is strongly associated with admission, but recorded median waits differ little across levels 2-5.</w:t>
       </w:r>
     </w:p>
     <w:p>
@@ -89,117 +53,41 @@
     <w:p>
       <w:r>
         <w:rPr>
-          <w:b/>
-        </w:rPr>
-        <w:t>What the data are.</w:t>
-      </w:r>
-      <w:r>
-        <w:rPr>
           <w:b w:val="0"/>
         </w:rPr>
-        <w:t xml:space="preserve"> The NCHS public-use file has </w:t>
-      </w:r>
-      <w:r>
-        <w:rPr>
-          <w:b/>
-        </w:rPr>
-        <w:t>21,061 rows and 1,031 columns</w:t>
-      </w:r>
-      <w:r>
-        <w:rPr>
-          <w:b w:val="0"/>
-        </w:rPr>
-        <w:t xml:space="preserve">. </w:t>
-      </w:r>
-      <w:r>
-        <w:rPr>
-          <w:b/>
-        </w:rPr>
-        <w:t>Each row is one sampled ED visit</w:t>
-      </w:r>
-      <w:r>
-        <w:rPr>
-          <w:b w:val="0"/>
-        </w:rPr>
-        <w:t xml:space="preserve"> (one Patient Record Form), not a patient: the same person could appear twice. Hospital code + patient code uniquely identify every row (0 duplicates), and the visits come from </w:t>
-      </w:r>
-      <w:r>
-        <w:rPr>
-          <w:b/>
-        </w:rPr>
-        <w:t>248 EDs</w:t>
-      </w:r>
-      <w:r>
-        <w:rPr>
-          <w:b w:val="0"/>
-        </w:rPr>
-        <w:t xml:space="preserve"> (median 94 sampled visits each). Summing the survey weight PATWT gives </w:t>
-      </w:r>
-      <w:r>
-        <w:rPr>
-          <w:b/>
-        </w:rPr>
-        <w:t>136,943,181 estimated U.S. ED visits</w:t>
-      </w:r>
-      <w:r>
-        <w:rPr>
-          <w:b w:val="0"/>
-        </w:rPr>
-        <w:t xml:space="preserve"> in 2015, exactly the documented total and well over 100 million. Weights are very unequal (117 to 42,002, median 5,232; the top 10% of rows carry 28.7% of weighted visits), and the sample over-represents the Northeast (20.4% of rows vs 17.3% of visits) while under-representing the South (33.3% vs 37.8%). We therefore weight every total, share and rate by PATWT.</w:t>
+        <w:t>The NCHS public-use file has 21,061 rows and 1,031 columns. Each row is one sampled ED visit (one Patient Record Form), not a patient, so the same person can appear more than once. Hospital code plus patient code uniquely identifies every row, and the visits come from 248 EDs (a median of 94 sampled visits each). The unweighted count is therefore 21,061 visits. Summing the patient visit weight PATWT gives 136,943,181 estimated U.S. ED visits in 2015, the total NCHS reports (codebook p.28) and well above 100 million. The weights are uneven (117 to 42,002; the 10% of rows with the largest weights carry 28.7% of weighted visits), and the sample does not mirror the country: the Northeast is 20.4% of rows but 17.3% of weighted visits, the South 33.3% versus 37.8%. We therefore weight every total, share and rate. We report weighted point estimates only; we did not compute design-based standard errors (strata CSTRATM, clusters CPSUM), so small differences should not be over-read.</w:t>
       </w:r>
     </w:p>
     <w:p>
       <w:r>
         <w:rPr>
-          <w:b/>
-        </w:rPr>
-        <w:t>Missing data are hidden as codes.</w:t>
-      </w:r>
-      <w:r>
-        <w:rPr>
           <w:b w:val="0"/>
         </w:rPr>
-        <w:t xml:space="preserve"> The standard pandas missing-value check (isna) reports NaN in 600 columns, but these are mostly empty drug-category text slots. Real missing answers are stored as negative numbers: </w:t>
-      </w:r>
-      <w:r>
-        <w:rPr>
-          <w:b/>
-        </w:rPr>
-        <w:t>-9 = blank, -8 = unknown, -7 = not applicable</w:t>
-      </w:r>
-      <w:r>
-        <w:rPr>
-          <w:b w:val="0"/>
-        </w:rPr>
-        <w:t xml:space="preserve"> (codebook p.37 onward). Counting those codes, 118 variables are more than 5% missing and 56 are more than 20% missing. For our variables: unimputed ethnicity 24.2% (so we use the imputed ETHIM, 0% missing), pain scale 29.5%, triage level 22.2%, wait time 15.2% blank (+3.4% not seen by a provider), payer 8.7%, length of visit 7.0%. INTENT15 (75% blank) and HDSTAT (91% "not applicable") are structurally missing: they are only asked for injury visits and admitted patients. We confirmed this reading of the codes by reproducing NCHS's published nonresponse rates (Table 1).</w:t>
+        <w:t>Missing values are mostly not stored as blanks. A standard pandas NaN count flags 600 columns, but those are largely unused drug-category text fields. NCHS records missing answers as negative codes: -9 (blank), -8 (unknown) and -7 (not applicable), as defined item by item in the codebook (p.37 onward). Counting -9 and -8, 118 variables are more than 5% missing and 56 more than 20%. Among the variables we use, unimputed ethnicity is 24.2% blank (so we use the imputed ETHIM), pain score 29.5%, triage level 22.2%, wait time 15.2% (plus 3.4% not applicable because the patient was not seen by a provider), expected payer 8.7% and length of visit 7.0%. Intent (INTENT15) and hospital discharge status (HDSTAT) are asked only for injury visits and admitted patients, respectively, so their high missing shares are by design.</w:t>
       </w:r>
     </w:p>
     <w:p>
       <w:r>
         <w:rPr>
-          <w:b/>
-        </w:rPr>
-        <w:t>Missingness is not random.</w:t>
-      </w:r>
-      <w:r>
-        <w:rPr>
           <w:b w:val="0"/>
         </w:rPr>
-        <w:t xml:space="preserve"> Wait time is missing for 7-12% of triaged visits but 38-45% of visits with no triage recorded, and for 9.8% of Midwest vs 19.7% of Northeast visits. This is a missing-at-random pattern tied to observable ED processes. Wait-time statistics therefore describe EDs that record wait times, and may understate waits in less-structured settings.</w:t>
+        <w:t>Missingness also varies with observed characteristics. Wait time is missing for 7-12% of visits at triage levels 1-5 but for 38-45% of visits where triage was blank, not performed or not offered, and it ranges from 9.8% of Midwest visits to 19.7% of Northeast visits. We cannot tell whether the missing waits are longer or shorter than recorded ones, so our wait-time results describe visits with a recorded wait and may not generalize to the rest.</w:t>
       </w:r>
     </w:p>
     <w:p>
       <w:r>
         <w:rPr>
-          <w:b/>
+          <w:b w:val="0"/>
         </w:rPr>
-        <w:t>Cleaning rules.</w:t>
+        <w:t>Before computing any statistic we converted -9/-8/-7 to missing, recoded yes/no items to 0/1, and converted arrival time from military time to an arrival hour (1.3% blank). Length of visit reaches 5,732 minutes and waits reach 1,305 minutes, so we emphasize medians and report means both raw and winsorized at the 99.5th percentile (98 and 86 visits capped) rather than deleting records.</w:t>
       </w:r>
+    </w:p>
+    <w:p>
       <w:r>
         <w:rPr>
           <w:b w:val="0"/>
         </w:rPr>
-        <w:t xml:space="preserve"> (1) Convert every -9/-8/-7 to missing before computing anything. (2) Recode yes/no items to 0/1. (3) Convert ARRTIME from military time to an arrival hour (1.3% blank). (4) Handle long tails rather than delete them: length of visit reaches 5,732 minutes (95 hours) and waits 1,305 minutes, so we report medians and winsorize means at the 99.5th percentile (98 and 86 visits capped). (5) Test the weighted mean, median and correlation functions on data with known answers, and re-check every published NCHS figure we could find. A final clean run passes all 20 of 20 verification checks.</w:t>
+        <w:t>We used two kinds of checks. Externally, Table 1 compares our estimates with figures published in the NCHS documentation; all agree to rounding except wait-time missingness (15.2% vs 15.7%). Internally, the total-chronic-conditions count equals the sum of the 22 condition checkboxes on every answered visit, the medication count equals the number of filled medication slots on every visit, the weighted mean, median and correlation functions reproduce hand-computed results on test data, and a final end-to-end re-run of the notebook reproduces 20 key values recorded during the question-by-question review (a reproducibility check, not an external validation).</w:t>
       </w:r>
     </w:p>
     <w:p>
@@ -213,7 +101,7 @@
           <w:color w:val="1F3A5F"/>
           <w:sz w:val="18"/>
         </w:rPr>
-        <w:t>Table 1. Our estimates reproduce every published NCHS figure we checked</w:t>
+        <w:t>Table 1. Selected estimates compared with figures published by NCHS</w:t>
       </w:r>
     </w:p>
     <w:tbl>
@@ -224,18 +112,20 @@
         <w:tblLook w:firstColumn="1" w:firstRow="1" w:lastColumn="0" w:lastRow="0" w:noHBand="0" w:noVBand="1" w:val="04A0"/>
       </w:tblPr>
       <w:tblGrid>
-        <w:gridCol w:w="3360"/>
-        <w:gridCol w:w="3360"/>
-        <w:gridCol w:w="3360"/>
+        <w:gridCol w:w="2520"/>
+        <w:gridCol w:w="2520"/>
+        <w:gridCol w:w="2520"/>
+        <w:gridCol w:w="2520"/>
       </w:tblGrid>
       <w:tr>
         <w:tc>
           <w:tcPr>
-            <w:tcW w:type="dxa" w:w="3888"/>
+            <w:tcW w:type="dxa" w:w="3960"/>
             <w:shd w:val="clear" w:color="auto" w:fill="E8EEF5"/>
           </w:tcPr>
           <w:p>
             <w:pPr>
+              <w:keepNext/>
               <w:spacing w:after="0"/>
             </w:pPr>
             <w:r>
@@ -243,17 +133,18 @@
                 <w:b/>
                 <w:sz w:val="17"/>
               </w:rPr>
-              <w:t>Check</w:t>
+              <w:t>Estimate</w:t>
             </w:r>
           </w:p>
         </w:tc>
         <w:tc>
           <w:tcPr>
-            <w:tcW w:type="dxa" w:w="2016"/>
+            <w:tcW w:type="dxa" w:w="1656"/>
             <w:shd w:val="clear" w:color="auto" w:fill="E8EEF5"/>
           </w:tcPr>
           <w:p>
             <w:pPr>
+              <w:keepNext/>
               <w:spacing w:after="0"/>
               <w:jc w:val="center"/>
             </w:pPr>
@@ -268,11 +159,12 @@
         </w:tc>
         <w:tc>
           <w:tcPr>
-            <w:tcW w:type="dxa" w:w="2304"/>
+            <w:tcW w:type="dxa" w:w="2088"/>
             <w:shd w:val="clear" w:color="auto" w:fill="E8EEF5"/>
           </w:tcPr>
           <w:p>
             <w:pPr>
+              <w:keepNext/>
               <w:spacing w:after="0"/>
               <w:jc w:val="center"/>
             </w:pPr>
@@ -281,7 +173,27 @@
                 <w:b/>
                 <w:sz w:val="17"/>
               </w:rPr>
-              <w:t>NCHS codebook</w:t>
+              <w:t>NCHS published</w:t>
+            </w:r>
+          </w:p>
+        </w:tc>
+        <w:tc>
+          <w:tcPr>
+            <w:tcW w:type="dxa" w:w="1944"/>
+            <w:shd w:val="clear" w:color="auto" w:fill="E8EEF5"/>
+          </w:tcPr>
+          <w:p>
+            <w:pPr>
+              <w:keepNext/>
+              <w:spacing w:after="0"/>
+              <w:jc w:val="center"/>
+            </w:pPr>
+            <w:r>
+              <w:rPr>
+                <w:b/>
+                <w:sz w:val="17"/>
+              </w:rPr>
+              <w:t>Agreement</w:t>
             </w:r>
           </w:p>
         </w:tc>
@@ -289,10 +201,11 @@
       <w:tr>
         <w:tc>
           <w:tcPr>
-            <w:tcW w:type="dxa" w:w="3888"/>
+            <w:tcW w:type="dxa" w:w="3960"/>
           </w:tcPr>
           <w:p>
             <w:pPr>
+              <w:keepNext/>
               <w:spacing w:after="0"/>
             </w:pPr>
             <w:r>
@@ -300,16 +213,17 @@
                 <w:b w:val="0"/>
                 <w:sz w:val="17"/>
               </w:rPr>
-              <w:t>Records</w:t>
+              <w:t>Records in file</w:t>
             </w:r>
           </w:p>
         </w:tc>
         <w:tc>
           <w:tcPr>
-            <w:tcW w:type="dxa" w:w="2016"/>
+            <w:tcW w:type="dxa" w:w="1656"/>
           </w:tcPr>
           <w:p>
             <w:pPr>
+              <w:keepNext/>
               <w:spacing w:after="0"/>
               <w:jc w:val="center"/>
             </w:pPr>
@@ -324,10 +238,11 @@
         </w:tc>
         <w:tc>
           <w:tcPr>
-            <w:tcW w:type="dxa" w:w="2304"/>
+            <w:tcW w:type="dxa" w:w="2088"/>
           </w:tcPr>
           <w:p>
             <w:pPr>
+              <w:keepNext/>
               <w:spacing w:after="0"/>
               <w:jc w:val="center"/>
             </w:pPr>
@@ -340,14 +255,34 @@
             </w:r>
           </w:p>
         </w:tc>
+        <w:tc>
+          <w:tcPr>
+            <w:tcW w:type="dxa" w:w="1944"/>
+          </w:tcPr>
+          <w:p>
+            <w:pPr>
+              <w:keepNext/>
+              <w:spacing w:after="0"/>
+              <w:jc w:val="center"/>
+            </w:pPr>
+            <w:r>
+              <w:rPr>
+                <w:b w:val="0"/>
+                <w:sz w:val="17"/>
+              </w:rPr>
+              <w:t>Exact</w:t>
+            </w:r>
+          </w:p>
+        </w:tc>
       </w:tr>
       <w:tr>
         <w:tc>
           <w:tcPr>
-            <w:tcW w:type="dxa" w:w="3888"/>
+            <w:tcW w:type="dxa" w:w="3960"/>
           </w:tcPr>
           <w:p>
             <w:pPr>
+              <w:keepNext/>
               <w:spacing w:after="0"/>
             </w:pPr>
             <w:r>
@@ -361,10 +296,11 @@
         </w:tc>
         <w:tc>
           <w:tcPr>
-            <w:tcW w:type="dxa" w:w="2016"/>
+            <w:tcW w:type="dxa" w:w="1656"/>
           </w:tcPr>
           <w:p>
             <w:pPr>
+              <w:keepNext/>
               <w:spacing w:after="0"/>
               <w:jc w:val="center"/>
             </w:pPr>
@@ -379,10 +315,11 @@
         </w:tc>
         <w:tc>
           <w:tcPr>
-            <w:tcW w:type="dxa" w:w="2304"/>
+            <w:tcW w:type="dxa" w:w="2088"/>
           </w:tcPr>
           <w:p>
             <w:pPr>
+              <w:keepNext/>
               <w:spacing w:after="0"/>
               <w:jc w:val="center"/>
             </w:pPr>
@@ -395,14 +332,34 @@
             </w:r>
           </w:p>
         </w:tc>
+        <w:tc>
+          <w:tcPr>
+            <w:tcW w:type="dxa" w:w="1944"/>
+          </w:tcPr>
+          <w:p>
+            <w:pPr>
+              <w:keepNext/>
+              <w:spacing w:after="0"/>
+              <w:jc w:val="center"/>
+            </w:pPr>
+            <w:r>
+              <w:rPr>
+                <w:b w:val="0"/>
+                <w:sz w:val="17"/>
+              </w:rPr>
+              <w:t>Exact</w:t>
+            </w:r>
+          </w:p>
+        </w:tc>
       </w:tr>
       <w:tr>
         <w:tc>
           <w:tcPr>
-            <w:tcW w:type="dxa" w:w="3888"/>
+            <w:tcW w:type="dxa" w:w="3960"/>
           </w:tcPr>
           <w:p>
             <w:pPr>
+              <w:keepNext/>
               <w:spacing w:after="0"/>
             </w:pPr>
             <w:r>
@@ -410,16 +367,17 @@
                 <w:b w:val="0"/>
                 <w:sz w:val="17"/>
               </w:rPr>
-              <w:t>Female share (weighted)</w:t>
+              <w:t>Female share of visits (weighted)</w:t>
             </w:r>
           </w:p>
         </w:tc>
         <w:tc>
           <w:tcPr>
-            <w:tcW w:type="dxa" w:w="2016"/>
+            <w:tcW w:type="dxa" w:w="1656"/>
           </w:tcPr>
           <w:p>
             <w:pPr>
+              <w:keepNext/>
               <w:spacing w:after="0"/>
               <w:jc w:val="center"/>
             </w:pPr>
@@ -434,10 +392,11 @@
         </w:tc>
         <w:tc>
           <w:tcPr>
-            <w:tcW w:type="dxa" w:w="2304"/>
+            <w:tcW w:type="dxa" w:w="2088"/>
           </w:tcPr>
           <w:p>
             <w:pPr>
+              <w:keepNext/>
               <w:spacing w:after="0"/>
               <w:jc w:val="center"/>
             </w:pPr>
@@ -450,14 +409,34 @@
             </w:r>
           </w:p>
         </w:tc>
+        <w:tc>
+          <w:tcPr>
+            <w:tcW w:type="dxa" w:w="1944"/>
+          </w:tcPr>
+          <w:p>
+            <w:pPr>
+              <w:keepNext/>
+              <w:spacing w:after="0"/>
+              <w:jc w:val="center"/>
+            </w:pPr>
+            <w:r>
+              <w:rPr>
+                <w:b w:val="0"/>
+                <w:sz w:val="17"/>
+              </w:rPr>
+              <w:t>Rounding</w:t>
+            </w:r>
+          </w:p>
+        </w:tc>
       </w:tr>
       <w:tr>
         <w:tc>
           <w:tcPr>
-            <w:tcW w:type="dxa" w:w="3888"/>
+            <w:tcW w:type="dxa" w:w="3960"/>
           </w:tcPr>
           <w:p>
             <w:pPr>
+              <w:keepNext/>
               <w:spacing w:after="0"/>
             </w:pPr>
             <w:r>
@@ -465,16 +444,17 @@
                 <w:b w:val="0"/>
                 <w:sz w:val="17"/>
               </w:rPr>
-              <w:t>Hispanic share (weighted)</w:t>
+              <w:t>Hispanic share of visits (weighted)</w:t>
             </w:r>
           </w:p>
         </w:tc>
         <w:tc>
           <w:tcPr>
-            <w:tcW w:type="dxa" w:w="2016"/>
+            <w:tcW w:type="dxa" w:w="1656"/>
           </w:tcPr>
           <w:p>
             <w:pPr>
+              <w:keepNext/>
               <w:spacing w:after="0"/>
               <w:jc w:val="center"/>
             </w:pPr>
@@ -489,10 +469,11 @@
         </w:tc>
         <w:tc>
           <w:tcPr>
-            <w:tcW w:type="dxa" w:w="2304"/>
+            <w:tcW w:type="dxa" w:w="2088"/>
           </w:tcPr>
           <w:p>
             <w:pPr>
+              <w:keepNext/>
               <w:spacing w:after="0"/>
               <w:jc w:val="center"/>
             </w:pPr>
@@ -505,14 +486,34 @@
             </w:r>
           </w:p>
         </w:tc>
+        <w:tc>
+          <w:tcPr>
+            <w:tcW w:type="dxa" w:w="1944"/>
+          </w:tcPr>
+          <w:p>
+            <w:pPr>
+              <w:keepNext/>
+              <w:spacing w:after="0"/>
+              <w:jc w:val="center"/>
+            </w:pPr>
+            <w:r>
+              <w:rPr>
+                <w:b w:val="0"/>
+                <w:sz w:val="17"/>
+              </w:rPr>
+              <w:t>Rounding</w:t>
+            </w:r>
+          </w:p>
+        </w:tc>
       </w:tr>
       <w:tr>
         <w:tc>
           <w:tcPr>
-            <w:tcW w:type="dxa" w:w="3888"/>
+            <w:tcW w:type="dxa" w:w="3960"/>
           </w:tcPr>
           <w:p>
             <w:pPr>
+              <w:keepNext/>
               <w:spacing w:after="0"/>
             </w:pPr>
             <w:r>
@@ -520,16 +521,17 @@
                 <w:b w:val="0"/>
                 <w:sz w:val="17"/>
               </w:rPr>
-              <w:t>Medicaid as primary payer (weighted)</w:t>
+              <w:t>Medicaid as primary expected payer, all visits</w:t>
             </w:r>
           </w:p>
         </w:tc>
         <w:tc>
           <w:tcPr>
-            <w:tcW w:type="dxa" w:w="2016"/>
+            <w:tcW w:type="dxa" w:w="1656"/>
           </w:tcPr>
           <w:p>
             <w:pPr>
+              <w:keepNext/>
               <w:spacing w:after="0"/>
               <w:jc w:val="center"/>
             </w:pPr>
@@ -544,10 +546,11 @@
         </w:tc>
         <w:tc>
           <w:tcPr>
-            <w:tcW w:type="dxa" w:w="2304"/>
+            <w:tcW w:type="dxa" w:w="2088"/>
           </w:tcPr>
           <w:p>
             <w:pPr>
+              <w:keepNext/>
               <w:spacing w:after="0"/>
               <w:jc w:val="center"/>
             </w:pPr>
@@ -560,14 +563,34 @@
             </w:r>
           </w:p>
         </w:tc>
+        <w:tc>
+          <w:tcPr>
+            <w:tcW w:type="dxa" w:w="1944"/>
+          </w:tcPr>
+          <w:p>
+            <w:pPr>
+              <w:keepNext/>
+              <w:spacing w:after="0"/>
+              <w:jc w:val="center"/>
+            </w:pPr>
+            <w:r>
+              <w:rPr>
+                <w:b w:val="0"/>
+                <w:sz w:val="17"/>
+              </w:rPr>
+              <w:t>Rounding</w:t>
+            </w:r>
+          </w:p>
+        </w:tc>
       </w:tr>
       <w:tr>
         <w:tc>
           <w:tcPr>
-            <w:tcW w:type="dxa" w:w="3888"/>
+            <w:tcW w:type="dxa" w:w="3960"/>
           </w:tcPr>
           <w:p>
             <w:pPr>
+              <w:keepNext/>
               <w:spacing w:after="0"/>
             </w:pPr>
             <w:r>
@@ -581,10 +604,11 @@
         </w:tc>
         <w:tc>
           <w:tcPr>
-            <w:tcW w:type="dxa" w:w="2016"/>
+            <w:tcW w:type="dxa" w:w="1656"/>
           </w:tcPr>
           <w:p>
             <w:pPr>
+              <w:keepNext/>
               <w:spacing w:after="0"/>
               <w:jc w:val="center"/>
             </w:pPr>
@@ -599,10 +623,11 @@
         </w:tc>
         <w:tc>
           <w:tcPr>
-            <w:tcW w:type="dxa" w:w="2304"/>
+            <w:tcW w:type="dxa" w:w="2088"/>
           </w:tcPr>
           <w:p>
             <w:pPr>
+              <w:keepNext/>
               <w:spacing w:after="0"/>
               <w:jc w:val="center"/>
             </w:pPr>
@@ -615,14 +640,34 @@
             </w:r>
           </w:p>
         </w:tc>
+        <w:tc>
+          <w:tcPr>
+            <w:tcW w:type="dxa" w:w="1944"/>
+          </w:tcPr>
+          <w:p>
+            <w:pPr>
+              <w:keepNext/>
+              <w:spacing w:after="0"/>
+              <w:jc w:val="center"/>
+            </w:pPr>
+            <w:r>
+              <w:rPr>
+                <w:b w:val="0"/>
+                <w:sz w:val="17"/>
+              </w:rPr>
+              <w:t>Rounding</w:t>
+            </w:r>
+          </w:p>
+        </w:tc>
       </w:tr>
       <w:tr>
         <w:tc>
           <w:tcPr>
-            <w:tcW w:type="dxa" w:w="3888"/>
+            <w:tcW w:type="dxa" w:w="3960"/>
           </w:tcPr>
           <w:p>
             <w:pPr>
+              <w:keepNext/>
               <w:spacing w:after="0"/>
             </w:pPr>
             <w:r>
@@ -636,10 +681,11 @@
         </w:tc>
         <w:tc>
           <w:tcPr>
-            <w:tcW w:type="dxa" w:w="2016"/>
+            <w:tcW w:type="dxa" w:w="1656"/>
           </w:tcPr>
           <w:p>
             <w:pPr>
+              <w:keepNext/>
               <w:spacing w:after="0"/>
               <w:jc w:val="center"/>
             </w:pPr>
@@ -654,10 +700,11 @@
         </w:tc>
         <w:tc>
           <w:tcPr>
-            <w:tcW w:type="dxa" w:w="2304"/>
+            <w:tcW w:type="dxa" w:w="2088"/>
           </w:tcPr>
           <w:p>
             <w:pPr>
+              <w:keepNext/>
               <w:spacing w:after="0"/>
               <w:jc w:val="center"/>
             </w:pPr>
@@ -670,14 +717,34 @@
             </w:r>
           </w:p>
         </w:tc>
+        <w:tc>
+          <w:tcPr>
+            <w:tcW w:type="dxa" w:w="1944"/>
+          </w:tcPr>
+          <w:p>
+            <w:pPr>
+              <w:keepNext/>
+              <w:spacing w:after="0"/>
+              <w:jc w:val="center"/>
+            </w:pPr>
+            <w:r>
+              <w:rPr>
+                <w:b w:val="0"/>
+                <w:sz w:val="17"/>
+              </w:rPr>
+              <w:t>Exact</w:t>
+            </w:r>
+          </w:p>
+        </w:tc>
       </w:tr>
       <w:tr>
         <w:tc>
           <w:tcPr>
-            <w:tcW w:type="dxa" w:w="3888"/>
+            <w:tcW w:type="dxa" w:w="3960"/>
           </w:tcPr>
           <w:p>
             <w:pPr>
+              <w:keepNext/>
               <w:spacing w:after="0"/>
             </w:pPr>
             <w:r>
@@ -685,16 +752,17 @@
                 <w:b w:val="0"/>
                 <w:sz w:val="17"/>
               </w:rPr>
-              <w:t>BUN/creatinine test ordered</w:t>
+              <w:t>BUN/creatinine test ordered, all visits</w:t>
             </w:r>
           </w:p>
         </w:tc>
         <w:tc>
           <w:tcPr>
-            <w:tcW w:type="dxa" w:w="2016"/>
+            <w:tcW w:type="dxa" w:w="1656"/>
           </w:tcPr>
           <w:p>
             <w:pPr>
+              <w:keepNext/>
               <w:spacing w:after="0"/>
               <w:jc w:val="center"/>
             </w:pPr>
@@ -709,10 +777,11 @@
         </w:tc>
         <w:tc>
           <w:tcPr>
-            <w:tcW w:type="dxa" w:w="2304"/>
+            <w:tcW w:type="dxa" w:w="2088"/>
           </w:tcPr>
           <w:p>
             <w:pPr>
+              <w:keepNext/>
               <w:spacing w:after="0"/>
               <w:jc w:val="center"/>
             </w:pPr>
@@ -725,11 +794,107 @@
             </w:r>
           </w:p>
         </w:tc>
+        <w:tc>
+          <w:tcPr>
+            <w:tcW w:type="dxa" w:w="1944"/>
+          </w:tcPr>
+          <w:p>
+            <w:pPr>
+              <w:keepNext/>
+              <w:spacing w:after="0"/>
+              <w:jc w:val="center"/>
+            </w:pPr>
+            <w:r>
+              <w:rPr>
+                <w:b w:val="0"/>
+                <w:sz w:val="17"/>
+              </w:rPr>
+              <w:t>Rounding</w:t>
+            </w:r>
+          </w:p>
+        </w:tc>
       </w:tr>
       <w:tr>
         <w:tc>
           <w:tcPr>
-            <w:tcW w:type="dxa" w:w="3888"/>
+            <w:tcW w:type="dxa" w:w="3960"/>
+          </w:tcPr>
+          <w:p>
+            <w:pPr>
+              <w:keepNext/>
+              <w:spacing w:after="0"/>
+            </w:pPr>
+            <w:r>
+              <w:rPr>
+                <w:b w:val="0"/>
+                <w:sz w:val="17"/>
+              </w:rPr>
+              <w:t>Missing: length of visit / expected payer</w:t>
+            </w:r>
+          </w:p>
+        </w:tc>
+        <w:tc>
+          <w:tcPr>
+            <w:tcW w:type="dxa" w:w="1656"/>
+          </w:tcPr>
+          <w:p>
+            <w:pPr>
+              <w:keepNext/>
+              <w:spacing w:after="0"/>
+              <w:jc w:val="center"/>
+            </w:pPr>
+            <w:r>
+              <w:rPr>
+                <w:b w:val="0"/>
+                <w:sz w:val="17"/>
+              </w:rPr>
+              <w:t>7.0% / 8.7%</w:t>
+            </w:r>
+          </w:p>
+        </w:tc>
+        <w:tc>
+          <w:tcPr>
+            <w:tcW w:type="dxa" w:w="2088"/>
+          </w:tcPr>
+          <w:p>
+            <w:pPr>
+              <w:keepNext/>
+              <w:spacing w:after="0"/>
+              <w:jc w:val="center"/>
+            </w:pPr>
+            <w:r>
+              <w:rPr>
+                <w:b w:val="0"/>
+                <w:sz w:val="17"/>
+              </w:rPr>
+              <w:t>7.0% / 8.7% (p.15)</w:t>
+            </w:r>
+          </w:p>
+        </w:tc>
+        <w:tc>
+          <w:tcPr>
+            <w:tcW w:type="dxa" w:w="1944"/>
+          </w:tcPr>
+          <w:p>
+            <w:pPr>
+              <w:keepNext/>
+              <w:spacing w:after="0"/>
+              <w:jc w:val="center"/>
+            </w:pPr>
+            <w:r>
+              <w:rPr>
+                <w:b w:val="0"/>
+                <w:sz w:val="17"/>
+              </w:rPr>
+              <w:t>Exact</w:t>
+            </w:r>
+          </w:p>
+        </w:tc>
+      </w:tr>
+      <w:tr>
+        <w:tc>
+          <w:tcPr>
+            <w:tcW w:type="dxa" w:w="3960"/>
           </w:tcPr>
           <w:p>
             <w:pPr>
@@ -740,13 +905,13 @@
                 <w:b w:val="0"/>
                 <w:sz w:val="17"/>
               </w:rPr>
-              <w:t>Length of visit / wait time missing</w:t>
+              <w:t>Missing: wait time</w:t>
             </w:r>
           </w:p>
         </w:tc>
         <w:tc>
           <w:tcPr>
-            <w:tcW w:type="dxa" w:w="2016"/>
+            <w:tcW w:type="dxa" w:w="1656"/>
           </w:tcPr>
           <w:p>
             <w:pPr>
@@ -758,13 +923,13 @@
                 <w:b w:val="0"/>
                 <w:sz w:val="17"/>
               </w:rPr>
-              <w:t>7.0% / 15.2%</w:t>
+              <w:t>15.2%</w:t>
             </w:r>
           </w:p>
         </w:tc>
         <w:tc>
           <w:tcPr>
-            <w:tcW w:type="dxa" w:w="2304"/>
+            <w:tcW w:type="dxa" w:w="2088"/>
           </w:tcPr>
           <w:p>
             <w:pPr>
@@ -776,7 +941,25 @@
                 <w:b w:val="0"/>
                 <w:sz w:val="17"/>
               </w:rPr>
-              <w:t>7.0% / 15.7% (p.15)</w:t>
+              <w:t>15.7% (p.15)</w:t>
+            </w:r>
+          </w:p>
+        </w:tc>
+        <w:tc>
+          <w:tcPr>
+            <w:tcW w:type="dxa" w:w="1944"/>
+          </w:tcPr>
+          <w:p>
+            <w:pPr>
+              <w:spacing w:after="0"/>
+              <w:jc w:val="center"/>
+            </w:pPr>
+            <w:r>
+              <w:rPr>
+                <w:b w:val="0"/>
+                <w:sz w:val="17"/>
+              </w:rPr>
+              <w:t>0.5 points lower</w:t>
             </w:r>
           </w:p>
         </w:tc>
@@ -784,7 +967,7 @@
     </w:tbl>
     <w:p>
       <w:pPr>
-        <w:spacing w:after="0"/>
+        <w:spacing w:after="40"/>
       </w:pPr>
     </w:p>
     <w:p>
@@ -806,7 +989,7 @@
           <w:color w:val="1F3A5F"/>
           <w:sz w:val="18"/>
         </w:rPr>
-        <w:t>Table 2. Descriptive statistics, unweighted vs weighted</w:t>
+        <w:t>Table 2. Descriptive statistics, unweighted and weighted</w:t>
       </w:r>
     </w:p>
     <w:tbl>
@@ -824,11 +1007,12 @@
       <w:tr>
         <w:tc>
           <w:tcPr>
-            <w:tcW w:type="dxa" w:w="5184"/>
+            <w:tcW w:type="dxa" w:w="5472"/>
             <w:shd w:val="clear" w:color="auto" w:fill="E8EEF5"/>
           </w:tcPr>
           <w:p>
             <w:pPr>
+              <w:keepNext/>
               <w:spacing w:after="0"/>
             </w:pPr>
             <w:r>
@@ -847,6 +1031,7 @@
           </w:tcPr>
           <w:p>
             <w:pPr>
+              <w:keepNext/>
               <w:spacing w:after="0"/>
               <w:jc w:val="center"/>
             </w:pPr>
@@ -866,6 +1051,7 @@
           </w:tcPr>
           <w:p>
             <w:pPr>
+              <w:keepNext/>
               <w:spacing w:after="0"/>
               <w:jc w:val="center"/>
             </w:pPr>
@@ -882,10 +1068,11 @@
       <w:tr>
         <w:tc>
           <w:tcPr>
-            <w:tcW w:type="dxa" w:w="5184"/>
+            <w:tcW w:type="dxa" w:w="5472"/>
           </w:tcPr>
           <w:p>
             <w:pPr>
+              <w:keepNext/>
               <w:spacing w:after="0"/>
             </w:pPr>
             <w:r>
@@ -893,7 +1080,7 @@
                 <w:b w:val="0"/>
                 <w:sz w:val="17"/>
               </w:rPr>
-              <w:t>Age: mean / median (years; 93 = top-code "93+")</w:t>
+              <w:t>Age, mean / median (years; 93 = top-coded "93+")</w:t>
             </w:r>
           </w:p>
         </w:tc>
@@ -903,6 +1090,7 @@
           </w:tcPr>
           <w:p>
             <w:pPr>
+              <w:keepNext/>
               <w:spacing w:after="0"/>
               <w:jc w:val="center"/>
             </w:pPr>
@@ -921,6 +1109,7 @@
           </w:tcPr>
           <w:p>
             <w:pPr>
+              <w:keepNext/>
               <w:spacing w:after="0"/>
               <w:jc w:val="center"/>
             </w:pPr>
@@ -937,10 +1126,11 @@
       <w:tr>
         <w:tc>
           <w:tcPr>
-            <w:tcW w:type="dxa" w:w="5184"/>
+            <w:tcW w:type="dxa" w:w="5472"/>
           </w:tcPr>
           <w:p>
             <w:pPr>
+              <w:keepNext/>
               <w:spacing w:after="0"/>
             </w:pPr>
             <w:r>
@@ -958,6 +1148,7 @@
           </w:tcPr>
           <w:p>
             <w:pPr>
+              <w:keepNext/>
               <w:spacing w:after="0"/>
               <w:jc w:val="center"/>
             </w:pPr>
@@ -976,6 +1167,7 @@
           </w:tcPr>
           <w:p>
             <w:pPr>
+              <w:keepNext/>
               <w:spacing w:after="0"/>
               <w:jc w:val="center"/>
             </w:pPr>
@@ -992,10 +1184,11 @@
       <w:tr>
         <w:tc>
           <w:tcPr>
-            <w:tcW w:type="dxa" w:w="5184"/>
+            <w:tcW w:type="dxa" w:w="5472"/>
           </w:tcPr>
           <w:p>
             <w:pPr>
+              <w:keepNext/>
               <w:spacing w:after="0"/>
             </w:pPr>
             <w:r>
@@ -1003,7 +1196,7 @@
                 <w:b w:val="0"/>
                 <w:sz w:val="17"/>
               </w:rPr>
-              <w:t>Wait to see a provider: median (n = 17,153)</w:t>
+              <w:t>Wait to see a provider, median (n = 17,153 with recorded wait)</w:t>
             </w:r>
           </w:p>
         </w:tc>
@@ -1013,6 +1206,7 @@
           </w:tcPr>
           <w:p>
             <w:pPr>
+              <w:keepNext/>
               <w:spacing w:after="0"/>
               <w:jc w:val="center"/>
             </w:pPr>
@@ -1031,6 +1225,7 @@
           </w:tcPr>
           <w:p>
             <w:pPr>
+              <w:keepNext/>
               <w:spacing w:after="0"/>
               <w:jc w:val="center"/>
             </w:pPr>
@@ -1047,10 +1242,11 @@
       <w:tr>
         <w:tc>
           <w:tcPr>
-            <w:tcW w:type="dxa" w:w="5184"/>
+            <w:tcW w:type="dxa" w:w="5472"/>
           </w:tcPr>
           <w:p>
             <w:pPr>
+              <w:keepNext/>
               <w:spacing w:after="0"/>
             </w:pPr>
             <w:r>
@@ -1058,7 +1254,7 @@
                 <w:b w:val="0"/>
                 <w:sz w:val="17"/>
               </w:rPr>
-              <w:t>Wait: mean, winsorized 99.5%</w:t>
+              <w:t>Wait, mean (winsorized at 99.5th percentile)</w:t>
             </w:r>
           </w:p>
         </w:tc>
@@ -1068,6 +1264,7 @@
           </w:tcPr>
           <w:p>
             <w:pPr>
+              <w:keepNext/>
               <w:spacing w:after="0"/>
               <w:jc w:val="center"/>
             </w:pPr>
@@ -1086,6 +1283,7 @@
           </w:tcPr>
           <w:p>
             <w:pPr>
+              <w:keepNext/>
               <w:spacing w:after="0"/>
               <w:jc w:val="center"/>
             </w:pPr>
@@ -1102,10 +1300,11 @@
       <w:tr>
         <w:tc>
           <w:tcPr>
-            <w:tcW w:type="dxa" w:w="5184"/>
+            <w:tcW w:type="dxa" w:w="5472"/>
           </w:tcPr>
           <w:p>
             <w:pPr>
+              <w:keepNext/>
               <w:spacing w:after="0"/>
             </w:pPr>
             <w:r>
@@ -1113,7 +1312,7 @@
                 <w:b w:val="0"/>
                 <w:sz w:val="17"/>
               </w:rPr>
-              <w:t>Length of visit: mean raw / winsorized (n = 19,581)</w:t>
+              <w:t>Length of visit, mean raw / winsorized (n = 19,581)</w:t>
             </w:r>
           </w:p>
         </w:tc>
@@ -1123,6 +1322,7 @@
           </w:tcPr>
           <w:p>
             <w:pPr>
+              <w:keepNext/>
               <w:spacing w:after="0"/>
               <w:jc w:val="center"/>
             </w:pPr>
@@ -1141,6 +1341,7 @@
           </w:tcPr>
           <w:p>
             <w:pPr>
+              <w:keepNext/>
               <w:spacing w:after="0"/>
               <w:jc w:val="center"/>
             </w:pPr>
@@ -1157,7 +1358,7 @@
       <w:tr>
         <w:tc>
           <w:tcPr>
-            <w:tcW w:type="dxa" w:w="5184"/>
+            <w:tcW w:type="dxa" w:w="5472"/>
           </w:tcPr>
           <w:p>
             <w:pPr>
@@ -1168,7 +1369,7 @@
                 <w:b w:val="0"/>
                 <w:sz w:val="17"/>
               </w:rPr>
-              <w:t>Length of visit: median</w:t>
+              <w:t>Length of visit, median</w:t>
             </w:r>
           </w:p>
         </w:tc>
@@ -1212,71 +1413,23 @@
     </w:tbl>
     <w:p>
       <w:pPr>
-        <w:spacing w:after="0"/>
+        <w:spacing w:after="40"/>
       </w:pPr>
     </w:p>
     <w:p>
       <w:r>
         <w:rPr>
-          <w:b/>
-        </w:rPr>
-        <w:t>Patient flow.</w:t>
-      </w:r>
-      <w:r>
-        <w:rPr>
           <w:b w:val="0"/>
         </w:rPr>
-        <w:t xml:space="preserve"> The typical patient is a young adult (median age 34), and 55% of visits are by women. Half of patients see a provider within </w:t>
-      </w:r>
-      <w:r>
-        <w:rPr>
-          <w:b/>
-        </w:rPr>
-        <w:t>18 minutes</w:t>
-      </w:r>
-      <w:r>
-        <w:rPr>
-          <w:b w:val="0"/>
-        </w:rPr>
-        <w:t xml:space="preserve">, but the mean wait (39 minutes) is twice the median. Length of visit is similarly skewed (median </w:t>
-      </w:r>
-      <w:r>
-        <w:rPr>
-          <w:b/>
-        </w:rPr>
-        <w:t>2.6 hours</w:t>
-      </w:r>
-      <w:r>
-        <w:rPr>
-          <w:b w:val="0"/>
-        </w:rPr>
-        <w:t xml:space="preserve">, mean 3.5 hours): a minority of very long waits and stays (for example, patients boarding while they wait for an inpatient bed) consumes a disproportionate share of bed-hours. By Little's law (average patients in the ED = arrival rate x time spent there), 375,000 visits/day x 3.56 hours means about </w:t>
-      </w:r>
-      <w:r>
-        <w:rPr>
-          <w:b/>
-        </w:rPr>
-        <w:t>55,700 patients are in U.S. EDs at any moment</w:t>
-      </w:r>
-      <w:r>
-        <w:rPr>
-          <w:b w:val="0"/>
-        </w:rPr>
-        <w:t>, roughly 12 per ED across the country's 4,820 EDs (codebook p.120). ED capacity is driven as much by throughput time as by arrivals.</w:t>
+        <w:t>The median patient is 34 years old, 55% of visits are by women and 16.5% by Hispanic patients (weighted). Half of patients with a recorded wait saw a provider within 18 minutes, but the mean wait is roughly twice the median, so a minority of long waits pulls the average up. The median visit lasts 154 minutes (2.6 hours) and the mean about 214 minutes. That long right tail matters for capacity, because long stays occupy beds and staff time. As a rough illustration, Little's law (average patients present = arrival rate x average time in the department) implies about 55,700 patients in U.S. EDs at a typical moment, or roughly 12 per ED across the 4,820 EDs NCHS estimates (codebook p.120), assuming steady arrivals.</w:t>
       </w:r>
     </w:p>
     <w:p>
       <w:r>
         <w:rPr>
-          <w:b/>
-        </w:rPr>
-        <w:t>Effect of weighting.</w:t>
-      </w:r>
-      <w:r>
-        <w:rPr>
           <w:b w:val="0"/>
         </w:rPr>
-        <w:t xml:space="preserve"> Weighting moves the headline numbers only slightly: mean age falls 0.5 years, mean length of visit falls 8 minutes, and children rise from 18.6% to 19.8% of visits. That's because the weights shift toward the under-sampled South and toward children, who have shorter visits. Medians do not move. So the sample is broadly representative, but unweighted counts are meaningless for volume (21,061 vs 136.9 million), and small tilts compound in subgroup analysis. We therefore weight everything.</w:t>
+        <w:t>Weighting changes these statistics only slightly: mean age falls by 0.5 years, mean length of visit by about 8 minutes, and children's share of visits rises from 18.6% to 19.8%; the medians do not change. Weighting matters less for these headline figures than for volumes and subgroups: unweighted counts do not measure national volume (21,061 records versus 136.9 million visits), and the sample's regional mix differs from the country's.</w:t>
       </w:r>
     </w:p>
     <w:p>
@@ -1300,7 +1453,7 @@
       <w:tr>
         <w:tc>
           <w:tcPr>
-            <w:tcW w:type="dxa" w:w="4968"/>
+            <w:tcW w:type="dxa" w:w="4896"/>
           </w:tcPr>
           <w:p>
             <w:pPr>
@@ -1310,7 +1463,7 @@
             <w:r>
               <w:drawing>
                 <wp:inline xmlns:a="http://schemas.openxmlformats.org/drawingml/2006/main" xmlns:pic="http://schemas.openxmlformats.org/drawingml/2006/picture">
-                  <wp:extent cx="3108960" cy="1243584"/>
+                  <wp:extent cx="3063240" cy="1225296"/>
                   <wp:docPr id="1" name="Picture 1"/>
                   <wp:cNvGraphicFramePr>
                     <a:graphicFrameLocks noChangeAspect="1"/>
@@ -1331,7 +1484,7 @@
                         <pic:spPr>
                           <a:xfrm>
                             <a:off x="0" y="0"/>
-                            <a:ext cx="3108960" cy="1243584"/>
+                            <a:ext cx="3063240" cy="1225296"/>
                           </a:xfrm>
                           <a:prstGeom prst="rect"/>
                         </pic:spPr>
@@ -1345,7 +1498,7 @@
         </w:tc>
         <w:tc>
           <w:tcPr>
-            <w:tcW w:type="dxa" w:w="4968"/>
+            <w:tcW w:type="dxa" w:w="4896"/>
           </w:tcPr>
           <w:p>
             <w:pPr>
@@ -1355,7 +1508,7 @@
             <w:r>
               <w:drawing>
                 <wp:inline xmlns:a="http://schemas.openxmlformats.org/drawingml/2006/main" xmlns:pic="http://schemas.openxmlformats.org/drawingml/2006/picture">
-                  <wp:extent cx="3108960" cy="1554480"/>
+                  <wp:extent cx="3063240" cy="1531620"/>
                   <wp:docPr id="2" name="Picture 2"/>
                   <wp:cNvGraphicFramePr>
                     <a:graphicFrameLocks noChangeAspect="1"/>
@@ -1376,7 +1529,7 @@
                         <pic:spPr>
                           <a:xfrm>
                             <a:off x="0" y="0"/>
-                            <a:ext cx="3108960" cy="1554480"/>
+                            <a:ext cx="3063240" cy="1531620"/>
                           </a:xfrm>
                           <a:prstGeom prst="rect"/>
                         </pic:spPr>
@@ -1392,80 +1545,33 @@
     </w:tbl>
     <w:p>
       <w:pPr>
-        <w:spacing w:after="120"/>
+        <w:spacing w:after="180"/>
         <w:jc w:val="center"/>
       </w:pPr>
       <w:r>
         <w:rPr>
-          <w:b/>
+          <w:b w:val="0"/>
+          <w:i/>
           <w:color w:val="52514E"/>
           <w:sz w:val="17"/>
         </w:rPr>
-        <w:t>Figure 1. Weighted ED arrivals by hour of day (left) and average visits per day by weekday (right)</w:t>
+        <w:t>Figure 1. Weighted arrivals by hour, as a share of visits with a recorded arrival time (98.7% of records), and average weighted visits per day by weekday</w:t>
       </w:r>
     </w:p>
     <w:p>
       <w:r>
         <w:rPr>
-          <w:b/>
-        </w:rPr>
-        <w:t>Busiest days and times.</w:t>
-      </w:r>
-      <w:r>
-        <w:rPr>
           <w:b w:val="0"/>
         </w:rPr>
-        <w:t xml:space="preserve"> Because 2015 had 53 Thursdays, we compare weekdays as average visits per day. </w:t>
-      </w:r>
-      <w:r>
-        <w:rPr>
-          <w:b/>
-        </w:rPr>
-        <w:t>Monday is busiest (432,000 visits/day)</w:t>
-      </w:r>
-      <w:r>
-        <w:rPr>
-          <w:b w:val="0"/>
-        </w:rPr>
-        <w:t xml:space="preserve"> and Sunday quietest (346,000), a 25% gap. Volume declines from Monday through Thursday. Arrivals bottom out between 3am and 6am (1.3-1.4% of daily arrivals per hour), climb steeply from 7am, and </w:t>
-      </w:r>
-      <w:r>
-        <w:rPr>
-          <w:b/>
-        </w:rPr>
-        <w:t>plateau from 10am to 8pm</w:t>
-      </w:r>
-      <w:r>
-        <w:rPr>
-          <w:b w:val="0"/>
-        </w:rPr>
-        <w:t xml:space="preserve">, peaking at </w:t>
-      </w:r>
-      <w:r>
-        <w:rPr>
-          <w:b/>
-        </w:rPr>
-        <w:t>6pm (6.3%)</w:t>
-      </w:r>
-      <w:r>
-        <w:rPr>
-          <w:b w:val="0"/>
-        </w:rPr>
-        <w:t>. The peak hour receives 4.7 times as many arrivals as the quietest, 69% of patients arrive between 10am and 10pm, and the single busiest slot is Monday 9-10am (about 28,500 visits nationally).</w:t>
+        <w:t>Because 2015 had 53 Thursdays and 52 of every other weekday, we compare days as average visits per day. Monday is the busiest day (432,000 visits per day) and Sunday the quietest (346,000), a 25% difference, with volume declining from Monday through Thursday. By hour, arrivals are lowest between 3am and 6am (about 1.3-1.4% of daily arrivals per hour), climb from 7am, and stay near their peak from 10am to 8pm; the single busiest hour is 6pm (6.3%). The peak hour receives 4.7 times as many arrivals as the quietest, and 69% of patients arrive between 10am and 10pm.</w:t>
       </w:r>
     </w:p>
     <w:p>
       <w:r>
         <w:rPr>
-          <w:b/>
-        </w:rPr>
-        <w:t>Staffing implications.</w:t>
-      </w:r>
-      <w:r>
-        <w:rPr>
           <w:b w:val="0"/>
         </w:rPr>
-        <w:t xml:space="preserve"> Staff to a long daytime plateau rather than a single peak. Stagger shift starts through the 7-10am ramp, and keep full coverage until roughly midnight: a patient arriving at the 6pm peak stays a median 2.6 hours, so occupancy peaks later than arrivals do. Roster more heavily on Mondays and Tuesdays, consistent with pent-up weekend demand while doctors' offices are closed. Overnight volume runs at about a quarter of peak, which suits lean staffing and on-call coverage.</w:t>
+        <w:t>For staffing, this points to planning around a long daytime and evening plateau rather than a single rush. Because the median patient stays about 2.6 hours, the number of patients in the department probably peaks after arrivals do, so coverage decisions should consider occupancy, which NHAMCS does not measure directly. The Monday excess is consistent with demand deferred over the weekend, but these data cannot establish the reason.</w:t>
       </w:r>
     </w:p>
     <w:p>
@@ -1473,7 +1579,7 @@
         <w:pStyle w:val="Heading1"/>
       </w:pPr>
       <w:r>
-        <w:t>4. Payer mix and financial exposure (Q5)</w:t>
+        <w:t>4. Payer mix (Q5)</w:t>
       </w:r>
     </w:p>
     <w:p>
@@ -1481,56 +1587,19 @@
         <w:rPr>
           <w:b w:val="0"/>
         </w:rPr>
-        <w:t xml:space="preserve">PAYTYPER assigns each visit one primary expected payer using an NCHS hierarchy. Across all visits (weighted), </w:t>
-      </w:r>
-      <w:r>
-        <w:rPr>
-          <w:b/>
-        </w:rPr>
-        <w:t>Medicaid/CHIP pays for 31.2%, private insurance 27.6%, Medicare 17.7% and self-pay 9.0%</w:t>
-      </w:r>
-      <w:r>
-        <w:rPr>
-          <w:b w:val="0"/>
-        </w:rPr>
-        <w:t xml:space="preserve">; for 10.8% the payer is blank or unknown. Among the 89.2% of visits with a known payer: </w:t>
-      </w:r>
-      <w:r>
-        <w:rPr>
-          <w:b/>
-        </w:rPr>
-        <w:t>Medicaid 34.9%, private 30.9%, Medicare 19.9%, self-pay 10.1%</w:t>
-      </w:r>
-      <w:r>
-        <w:rPr>
-          <w:b w:val="0"/>
-        </w:rPr>
-        <w:t>. Public payers together cover 54.8%, and self-pay plus charity care cover 11.0%. Payer mix is driven by age (Figure 2): Medicaid pays for 65% of child visits, Medicare for 78-87% of visits by patients 65 and over, and self-pay peaks at 17.5% among 25-44-year-olds.</w:t>
-      </w:r>
-    </w:p>
-    <w:p>
-      <w:r>
-        <w:rPr>
-          <w:b/>
-        </w:rPr>
-        <w:t>Financial performance.</w:t>
-      </w:r>
-      <w:r>
-        <w:rPr>
-          <w:b w:val="0"/>
-        </w:rPr>
-        <w:t xml:space="preserve"> More than half of ED revenue comes from public payers, which typically reimburse below private rates, and about 1 in 9 visits is uninsured or charity care. Federal law (EMTALA) requires EDs to screen and stabilize everyone regardless of ability to pay, so hospitals cannot turn this demand away. Privately insured visits (under a third) cross-subsidize the rest. The 10.8% of visits with an unknown payer point to a documentation and revenue-cycle gap. Young adults are the main bad-debt exposure, and an aging population will shift mix further toward Medicare.</w:t>
+        <w:t>PAYTYPER is the primary expected source of payment, chosen by an NCHS hierarchy when a visit lists several; it is not a record of revenue actually collected. Across all visits (weighted), Medicaid/CHIP is the expected payer for 31.2%, private insurance 27.6%, Medicare 17.7% and self-pay 9.0%; for 10.8% the payer is blank or unknown. Medicaid and Medicare together account for 48.9% of all visits and 54.8% of the 89.2% of visits with a known expected payer (Medicaid 34.9%, private 30.9%, Medicare 19.9%, self-pay 10.1%; self-pay and no charge together 11.0%). Age drives much of this mix (Figure 2): Medicaid is the expected payer for 65% of visits by children, Medicare for 78-87% of visits by patients 65 and older, and self-pay peaks at 17.5% among 25-44-year-olds.</w:t>
       </w:r>
     </w:p>
     <w:p>
       <w:pPr>
+        <w:keepNext/>
         <w:spacing w:after="0"/>
         <w:jc w:val="center"/>
       </w:pPr>
       <w:r>
         <w:drawing>
           <wp:inline xmlns:a="http://schemas.openxmlformats.org/drawingml/2006/main" xmlns:pic="http://schemas.openxmlformats.org/drawingml/2006/picture">
-            <wp:extent cx="4206240" cy="2103120"/>
+            <wp:extent cx="3657600" cy="1828800"/>
             <wp:docPr id="3" name="Picture 3"/>
             <wp:cNvGraphicFramePr>
               <a:graphicFrameLocks noChangeAspect="1"/>
@@ -1551,7 +1620,7 @@
                   <pic:spPr>
                     <a:xfrm>
                       <a:off x="0" y="0"/>
-                      <a:ext cx="4206240" cy="2103120"/>
+                      <a:ext cx="3657600" cy="1828800"/>
                     </a:xfrm>
                     <a:prstGeom prst="rect"/>
                   </pic:spPr>
@@ -1564,16 +1633,25 @@
     </w:p>
     <w:p>
       <w:pPr>
-        <w:spacing w:after="120"/>
+        <w:spacing w:after="180"/>
         <w:jc w:val="center"/>
       </w:pPr>
       <w:r>
         <w:rPr>
-          <w:b/>
+          <w:b w:val="0"/>
+          <w:i/>
           <w:color w:val="52514E"/>
           <w:sz w:val="17"/>
         </w:rPr>
-        <w:t>Figure 2. Primary expected payer by age group (weighted, known payer)</w:t>
+        <w:t>Figure 2. Primary expected payer by age group, weighted % of visits with a known expected payer</w:t>
+      </w:r>
+    </w:p>
+    <w:p>
+      <w:r>
+        <w:rPr>
+          <w:b w:val="0"/>
+        </w:rPr>
+        <w:t>If public programs pay less per visit than private insurers, as is commonly the case, an ED whose mix resembles this national profile would earn less per visit than one serving more privately insured patients, and self-pay and no-charge visits carry a higher risk of unpaid bills. Because EDs must screen and stabilize patients regardless of ability to pay (EMTALA), hospitals have little control over this mix at the door. These data cannot measure the financial effect directly: actual revenue depends on contracts and collections that NHAMCS does not record, and 10.8% of visits lack a recorded payer.</w:t>
       </w:r>
     </w:p>
     <w:p>
@@ -1581,124 +1659,63 @@
         <w:pStyle w:val="Heading1"/>
       </w:pPr>
       <w:r>
-        <w:t>5. Clinical profile: chronic disease, injuries, diagnostics, medications (Q6-Q9)</w:t>
+        <w:t>5. Clinical profile (Q6-Q9)</w:t>
       </w:r>
     </w:p>
-    <w:tbl>
-      <w:tblPr>
-        <w:tblW w:type="auto" w:w="0"/>
-        <w:jc w:val="center"/>
-        <w:tblLook w:firstColumn="1" w:firstRow="1" w:lastColumn="0" w:lastRow="0" w:noHBand="0" w:noVBand="1" w:val="04A0"/>
-      </w:tblPr>
-      <w:tblGrid>
-        <w:gridCol w:w="5040"/>
-        <w:gridCol w:w="5040"/>
-      </w:tblGrid>
-      <w:tr>
-        <w:tc>
-          <w:tcPr>
-            <w:tcW w:type="dxa" w:w="4968"/>
-          </w:tcPr>
-          <w:p>
-            <w:pPr>
-              <w:spacing w:after="0"/>
-              <w:jc w:val="center"/>
-            </w:pPr>
-            <w:r>
-              <w:drawing>
-                <wp:inline xmlns:a="http://schemas.openxmlformats.org/drawingml/2006/main" xmlns:pic="http://schemas.openxmlformats.org/drawingml/2006/picture">
-                  <wp:extent cx="3108960" cy="1865376"/>
-                  <wp:docPr id="4" name="Picture 4"/>
-                  <wp:cNvGraphicFramePr>
-                    <a:graphicFrameLocks noChangeAspect="1"/>
-                  </wp:cNvGraphicFramePr>
-                  <a:graphic>
-                    <a:graphicData uri="http://schemas.openxmlformats.org/drawingml/2006/picture">
-                      <pic:pic>
-                        <pic:nvPicPr>
-                          <pic:cNvPr id="0" name="q6_chronic_condition_prevalence.png"/>
-                          <pic:cNvPicPr/>
-                        </pic:nvPicPr>
-                        <pic:blipFill>
-                          <a:blip r:embed="rId12"/>
-                          <a:stretch>
-                            <a:fillRect/>
-                          </a:stretch>
-                        </pic:blipFill>
-                        <pic:spPr>
-                          <a:xfrm>
-                            <a:off x="0" y="0"/>
-                            <a:ext cx="3108960" cy="1865376"/>
-                          </a:xfrm>
-                          <a:prstGeom prst="rect"/>
-                        </pic:spPr>
-                      </pic:pic>
-                    </a:graphicData>
-                  </a:graphic>
-                </wp:inline>
-              </w:drawing>
-            </w:r>
-          </w:p>
-        </w:tc>
-        <w:tc>
-          <w:tcPr>
-            <w:tcW w:type="dxa" w:w="4968"/>
-          </w:tcPr>
-          <w:p>
-            <w:pPr>
-              <w:spacing w:after="0"/>
-              <w:jc w:val="center"/>
-            </w:pPr>
-            <w:r>
-              <w:drawing>
-                <wp:inline xmlns:a="http://schemas.openxmlformats.org/drawingml/2006/main" xmlns:pic="http://schemas.openxmlformats.org/drawingml/2006/picture">
-                  <wp:extent cx="3108960" cy="2020824"/>
-                  <wp:docPr id="5" name="Picture 5"/>
-                  <wp:cNvGraphicFramePr>
-                    <a:graphicFrameLocks noChangeAspect="1"/>
-                  </wp:cNvGraphicFramePr>
-                  <a:graphic>
-                    <a:graphicData uri="http://schemas.openxmlformats.org/drawingml/2006/picture">
-                      <pic:pic>
-                        <pic:nvPicPr>
-                          <pic:cNvPr id="0" name="q8_blood_tests.png"/>
-                          <pic:cNvPicPr/>
-                        </pic:nvPicPr>
-                        <pic:blipFill>
-                          <a:blip r:embed="rId13"/>
-                          <a:stretch>
-                            <a:fillRect/>
-                          </a:stretch>
-                        </pic:blipFill>
-                        <pic:spPr>
-                          <a:xfrm>
-                            <a:off x="0" y="0"/>
-                            <a:ext cx="3108960" cy="2020824"/>
-                          </a:xfrm>
-                          <a:prstGeom prst="rect"/>
-                        </pic:spPr>
-                      </pic:pic>
-                    </a:graphicData>
-                  </a:graphic>
-                </wp:inline>
-              </w:drawing>
-            </w:r>
-          </w:p>
-        </w:tc>
-      </w:tr>
-    </w:tbl>
     <w:p>
       <w:pPr>
-        <w:spacing w:after="120"/>
+        <w:keepNext/>
+        <w:spacing w:after="0"/>
+        <w:jc w:val="center"/>
+      </w:pPr>
+      <w:r>
+        <w:drawing>
+          <wp:inline xmlns:a="http://schemas.openxmlformats.org/drawingml/2006/main" xmlns:pic="http://schemas.openxmlformats.org/drawingml/2006/picture">
+            <wp:extent cx="4480560" cy="1680210"/>
+            <wp:docPr id="4" name="Picture 4"/>
+            <wp:cNvGraphicFramePr>
+              <a:graphicFrameLocks noChangeAspect="1"/>
+            </wp:cNvGraphicFramePr>
+            <a:graphic>
+              <a:graphicData uri="http://schemas.openxmlformats.org/drawingml/2006/picture">
+                <pic:pic>
+                  <pic:nvPicPr>
+                    <pic:cNvPr id="0" name="fig_chronic_combined_diabetes.png"/>
+                    <pic:cNvPicPr/>
+                  </pic:nvPicPr>
+                  <pic:blipFill>
+                    <a:blip r:embed="rId12"/>
+                    <a:stretch>
+                      <a:fillRect/>
+                    </a:stretch>
+                  </pic:blipFill>
+                  <pic:spPr>
+                    <a:xfrm>
+                      <a:off x="0" y="0"/>
+                      <a:ext cx="4480560" cy="1680210"/>
+                    </a:xfrm>
+                    <a:prstGeom prst="rect"/>
+                  </pic:spPr>
+                </pic:pic>
+              </a:graphicData>
+            </a:graphic>
+          </wp:inline>
+        </w:drawing>
+      </w:r>
+    </w:p>
+    <w:p>
+      <w:pPr>
+        <w:spacing w:after="180"/>
         <w:jc w:val="center"/>
       </w:pPr>
       <w:r>
         <w:rPr>
-          <w:b/>
+          <w:b w:val="0"/>
+          <w:i/>
           <w:color w:val="52514E"/>
           <w:sz w:val="17"/>
         </w:rPr>
-        <w:t>Figure 3. Most common chronic conditions (left) and blood tests ordered at blood-test visits (right), weighted</w:t>
+        <w:t>Figure 3. Hypertension and diabetes are the most commonly recorded chronic conditions: weighted % of visits with the chronic-condition section completed (98.4% of records). "Any diabetes" combines three checkboxes; type 2 alone is 4.7%. Chart re-plotted from the verified Q6 output.</w:t>
       </w:r>
     </w:p>
     <w:p>
@@ -1712,43 +1729,7 @@
         <w:rPr>
           <w:b w:val="0"/>
         </w:rPr>
-        <w:t xml:space="preserve"> Excluding the 1.6% of visits where the section was blank, </w:t>
-      </w:r>
-      <w:r>
-        <w:rPr>
-          <w:b/>
-        </w:rPr>
-        <w:t>47.6% of visits involve at least one chronic condition</w:t>
-      </w:r>
-      <w:r>
-        <w:rPr>
-          <w:b w:val="0"/>
-        </w:rPr>
-        <w:t xml:space="preserve"> (48.5% unweighted) and 14.9% involve three or more. TOTCHRON matches the 22 individual checkboxes on 100% of visits. </w:t>
-      </w:r>
-      <w:r>
-        <w:rPr>
-          <w:b/>
-        </w:rPr>
-        <w:t>Hypertension is most prevalent (24.0%)</w:t>
-      </w:r>
-      <w:r>
-        <w:rPr>
-          <w:b w:val="0"/>
-        </w:rPr>
-        <w:t xml:space="preserve">, followed by asthma (10.0%) and depression (9.5%). Diabetes type 2 alone is 4.7% and obesity 3.6%, but diabetes is split across three checkboxes: combined, </w:t>
-      </w:r>
-      <w:r>
-        <w:rPr>
-          <w:b/>
-        </w:rPr>
-        <w:t>any diabetes covers 11.1%</w:t>
-      </w:r>
-      <w:r>
-        <w:rPr>
-          <w:b w:val="0"/>
-        </w:rPr>
-        <w:t>, making it the second most common condition. Chronic burden rises from 13% of under-15 visits to 90% of visits by patients 75+. EDs are therefore a front line for chronic disease: many visits are flare-ups of conditions that primary care could manage. That argues for ED-based care coordination, follow-up referrals and medication reconciliation.</w:t>
+        <w:t xml:space="preserve"> Among visits with the chronic-condition section completed (1.6% of records were blank), 47.6% record at least one chronic condition (weighted; 48.5% unweighted) and 14.9% record three or more. Hypertension is the most common (24.0%). Diabetes is split across three checkboxes (type 1, type 2 and unspecified); counting any of them, 11.1% of visits record diabetes, making it second, whereas type 2 alone is 4.7%. Asthma (10.0%) and depression (9.5%) follow; obesity (3.6%) likely understates true prevalence because it depends on documentation. The share with a chronic condition rises from 13% of visits by children under 15 to 90% at 75 and older. These flags describe patients' conditions, not the reason for the visit, so they do not show whether visits were flare-ups or avoidable. They do show that ED clinicians routinely treat patients whose chronic illness can complicate care; whether better coordination would change ED use is a question these data cannot answer.</w:t>
       </w:r>
     </w:p>
     <w:p>
@@ -1762,31 +1743,7 @@
         <w:rPr>
           <w:b w:val="0"/>
         </w:rPr>
-        <w:t xml:space="preserve"> </w:t>
-      </w:r>
-      <w:r>
-        <w:rPr>
-          <w:b/>
-        </w:rPr>
-        <w:t>33.1% of visits</w:t>
-      </w:r>
-      <w:r>
-        <w:rPr>
-          <w:b w:val="0"/>
-        </w:rPr>
-        <w:t xml:space="preserve"> (weighted) relate to an injury (29.5%), an overdose or poisoning (1.4%) or an adverse effect of medical care (2.2%). Intent is never recorded for adverse effects (the question is only asked for injuries and overdoses), and it's blank for 21% of injuries. </w:t>
-      </w:r>
-      <w:r>
-        <w:rPr>
-          <w:b/>
-        </w:rPr>
-        <w:t>Among visits with known intent, 7.3% are intentional and 92.7% unintentional.</w:t>
-      </w:r>
-      <w:r>
-        <w:rPr>
-          <w:b w:val="0"/>
-        </w:rPr>
-        <w:t xml:space="preserve"> Intentional shares are highest for overdoses (13.2%) and patients aged 15-24 (12.1%).</w:t>
+        <w:t xml:space="preserve"> In all, 33.1% of visits (weighted) are coded as related to an injury (29.5%), an overdose or poisoning (1.4%) or an adverse effect of medical care (2.2%). Intent is recorded only for injuries and overdoses, and about a quarter of this combined group (25.7%, including every adverse-effect visit) has no intent recorded. Among visits with known intent, 7.3% are intentional and 92.7% unintentional. Overdoses and poisonings are more often recorded as intentional (13.2%), and among visits with known intent the intentional share is highest at ages 15-24 (12.1%).</w:t>
       </w:r>
     </w:p>
     <w:p>
@@ -1794,37 +1751,13 @@
         <w:rPr>
           <w:b/>
         </w:rPr>
-        <w:t>Diagnostics (Q8).</w:t>
+        <w:t>Diagnostic services (Q8).</w:t>
       </w:r>
       <w:r>
         <w:rPr>
           <w:b w:val="0"/>
         </w:rPr>
-        <w:t xml:space="preserve"> </w:t>
-      </w:r>
-      <w:r>
-        <w:rPr>
-          <w:b/>
-        </w:rPr>
-        <w:t>47.0% of visits include imaging</w:t>
-      </w:r>
-      <w:r>
-        <w:rPr>
-          <w:b w:val="0"/>
-        </w:rPr>
-        <w:t xml:space="preserve"> (X-ray 33.7%, CT 16.5%, ultrasound 4.4%, MRI 0.7%), rising from 29% for children to 70% for patients 75+, and from 44% of non-injury visits to 54% of injury visits. 42.4% of visits include a blood test. At those visits, </w:t>
-      </w:r>
-      <w:r>
-        <w:rPr>
-          <w:b/>
-        </w:rPr>
-        <w:t>CBC is by far the most common (85.4%)</w:t>
-      </w:r>
-      <w:r>
-        <w:rPr>
-          <w:b w:val="0"/>
-        </w:rPr>
-        <w:t>, followed by the comprehensive (55.3%) and basic (25.2%) metabolic panels, with 3.2 different tests per visit on average. Standalone glucose, BUN/creatinine and electrolytes are low because the panels already include them.</w:t>
+        <w:t xml:space="preserve"> Imaging is used at 47.0% of all visits (weighted): X-ray 33.7%, CT 16.5%, ultrasound 4.4% and MRI 0.7%. Use rises with age, from 29% of visits by children to 70% at 75 and older, and is higher for injury visits (54%) than other visits (44%). At least one blood test is ordered at 42.4% of visits. Among those visits, a complete blood count is by far the most common test (85.4%), followed by the comprehensive (55.3%) and basic (25.2%) metabolic panels, with 3.2 different tests per visit on average. Standalone glucose, BUN/creatinine and electrolyte orders are less common partly because the metabolic panels include those tests; the 2015 form added separate panel checkboxes (codebook pp.3-4).</w:t>
       </w:r>
     </w:p>
     <w:p>
@@ -1838,31 +1771,7 @@
         <w:rPr>
           <w:b w:val="0"/>
         </w:rPr>
-        <w:t xml:space="preserve"> The weighted </w:t>
-      </w:r>
-      <w:r>
-        <w:rPr>
-          <w:b/>
-        </w:rPr>
-        <w:t>mean is 2.49 medications per visit and the median is 2</w:t>
-      </w:r>
-      <w:r>
-        <w:rPr>
-          <w:b w:val="0"/>
-        </w:rPr>
-        <w:t xml:space="preserve">. </w:t>
-      </w:r>
-      <w:r>
-        <w:rPr>
-          <w:b/>
-        </w:rPr>
-        <w:t>20.9% of visits involve none, 41.9% involve 1-2 and 37.2% involve 3 or more</w:t>
-      </w:r>
-      <w:r>
-        <w:rPr>
-          <w:b w:val="0"/>
-        </w:rPr>
-        <w:t>, exactly matching NCHS (Table 1). On average 1.62 are given in the ED and 1.08 prescribed at discharge. Treatment intensity tracks complexity: 2.0 medications with no chronic condition vs 3.8 with three or more, peaking at 3.1 for ages 45-64. More than a third of visits are pharmacologically complex, which raises medication-safety and pharmacy-staffing needs.</w:t>
+        <w:t xml:space="preserve"> The weighted mean is 2.49 medications per visit and the median is 2: 20.9% of visits involve no medication, 41.9% involve one or two and 37.2% involve three or more, matching the NCHS distribution (Table 1). On average 1.62 medications are given in the ED and 1.08 prescribed at discharge. The count rises with patient complexity, from 2.0 for visits with no recorded chronic condition to 3.8 for visits with three or more, and peaks at 3.1 for ages 45-64. With more than a third of visits involving three or more medications, medication reconciliation and interaction checking are a routine part of ED care rather than an edge case.</w:t>
       </w:r>
     </w:p>
     <w:p>
@@ -1878,19 +1787,7 @@
         <w:rPr>
           <w:b w:val="0"/>
         </w:rPr>
-        <w:t xml:space="preserve">We built about 20 cleaned variables (codes set to missing, wait and length of visit winsorized) and computed </w:t>
-      </w:r>
-      <w:r>
-        <w:rPr>
-          <w:b/>
-        </w:rPr>
-        <w:t>weighted</w:t>
-      </w:r>
-      <w:r>
-        <w:rPr>
-          <w:b w:val="0"/>
-        </w:rPr>
-        <w:t xml:space="preserve"> Pearson correlations using rows where both variables are present. Triage level runs from 1 = immediate to 5 = nonurgent, so a negative r means "more for urgent patients".</w:t>
+        <w:t>We built about 20 cleaned variables (missing codes removed, wait and length of visit winsorized) and computed weighted Pearson correlations, each using the visits where both variables are present. Triage level runs from 1 (immediate) to 5 (nonurgent), so a negative correlation means more of something among more urgent patients. The correlations describe associations, not causal effects.</w:t>
       </w:r>
     </w:p>
     <w:p>
@@ -1922,11 +1819,12 @@
       <w:tr>
         <w:tc>
           <w:tcPr>
-            <w:tcW w:type="dxa" w:w="3600"/>
+            <w:tcW w:type="dxa" w:w="4104"/>
             <w:shd w:val="clear" w:color="auto" w:fill="E8EEF5"/>
           </w:tcPr>
           <w:p>
             <w:pPr>
+              <w:keepNext/>
               <w:spacing w:after="0"/>
             </w:pPr>
             <w:r>
@@ -1945,6 +1843,7 @@
           </w:tcPr>
           <w:p>
             <w:pPr>
+              <w:keepNext/>
               <w:spacing w:after="0"/>
               <w:jc w:val="center"/>
             </w:pPr>
@@ -1959,11 +1858,12 @@
         </w:tc>
         <w:tc>
           <w:tcPr>
-            <w:tcW w:type="dxa" w:w="4464"/>
+            <w:tcW w:type="dxa" w:w="4536"/>
             <w:shd w:val="clear" w:color="auto" w:fill="E8EEF5"/>
           </w:tcPr>
           <w:p>
             <w:pPr>
+              <w:keepNext/>
               <w:spacing w:after="0"/>
             </w:pPr>
             <w:r>
@@ -1971,7 +1871,7 @@
                 <w:b/>
                 <w:sz w:val="17"/>
               </w:rPr>
-              <w:t>Reading</w:t>
+              <w:t>Interpretation</w:t>
             </w:r>
           </w:p>
         </w:tc>
@@ -1979,10 +1879,11 @@
       <w:tr>
         <w:tc>
           <w:tcPr>
-            <w:tcW w:type="dxa" w:w="3600"/>
+            <w:tcW w:type="dxa" w:w="4104"/>
           </w:tcPr>
           <w:p>
             <w:pPr>
+              <w:keepNext/>
               <w:spacing w:after="0"/>
             </w:pPr>
             <w:r>
@@ -1990,7 +1891,7 @@
                 <w:b w:val="0"/>
                 <w:sz w:val="17"/>
               </w:rPr>
-              <w:t>Age - Medicare</w:t>
+              <w:t>Age and Medicare as expected payer</w:t>
             </w:r>
           </w:p>
         </w:tc>
@@ -2000,6 +1901,7 @@
           </w:tcPr>
           <w:p>
             <w:pPr>
+              <w:keepNext/>
               <w:spacing w:after="0"/>
               <w:jc w:val="center"/>
             </w:pPr>
@@ -2014,10 +1916,11 @@
         </w:tc>
         <w:tc>
           <w:tcPr>
-            <w:tcW w:type="dxa" w:w="4464"/>
+            <w:tcW w:type="dxa" w:w="4536"/>
           </w:tcPr>
           <w:p>
             <w:pPr>
+              <w:keepNext/>
               <w:spacing w:after="0"/>
             </w:pPr>
             <w:r>
@@ -2025,7 +1928,7 @@
                 <w:b w:val="0"/>
                 <w:sz w:val="17"/>
               </w:rPr>
-              <w:t>Mechanical: Medicare eligibility starts at 65</w:t>
+              <w:t>Largely mechanical: Medicare eligibility at 65</w:t>
             </w:r>
           </w:p>
         </w:tc>
@@ -2033,10 +1936,11 @@
       <w:tr>
         <w:tc>
           <w:tcPr>
-            <w:tcW w:type="dxa" w:w="3600"/>
+            <w:tcW w:type="dxa" w:w="4104"/>
           </w:tcPr>
           <w:p>
             <w:pPr>
+              <w:keepNext/>
               <w:spacing w:after="0"/>
             </w:pPr>
             <w:r>
@@ -2044,7 +1948,7 @@
                 <w:b w:val="0"/>
                 <w:sz w:val="17"/>
               </w:rPr>
-              <w:t>Age - # chronic conditions</w:t>
+              <w:t>Age and number of chronic conditions</w:t>
             </w:r>
           </w:p>
         </w:tc>
@@ -2054,6 +1958,7 @@
           </w:tcPr>
           <w:p>
             <w:pPr>
+              <w:keepNext/>
               <w:spacing w:after="0"/>
               <w:jc w:val="center"/>
             </w:pPr>
@@ -2068,10 +1973,11 @@
         </w:tc>
         <w:tc>
           <w:tcPr>
-            <w:tcW w:type="dxa" w:w="4464"/>
+            <w:tcW w:type="dxa" w:w="4536"/>
           </w:tcPr>
           <w:p>
             <w:pPr>
+              <w:keepNext/>
               <w:spacing w:after="0"/>
             </w:pPr>
             <w:r>
@@ -2079,7 +1985,7 @@
                 <w:b w:val="0"/>
                 <w:sz w:val="17"/>
               </w:rPr>
-              <w:t>Chronic burden accumulates with age</w:t>
+              <w:t>Chronic conditions accumulate with age</w:t>
             </w:r>
           </w:p>
         </w:tc>
@@ -2087,10 +1993,11 @@
       <w:tr>
         <w:tc>
           <w:tcPr>
-            <w:tcW w:type="dxa" w:w="3600"/>
+            <w:tcW w:type="dxa" w:w="4104"/>
           </w:tcPr>
           <w:p>
             <w:pPr>
+              <w:keepNext/>
               <w:spacing w:after="0"/>
             </w:pPr>
             <w:r>
@@ -2098,7 +2005,7 @@
                 <w:b w:val="0"/>
                 <w:sz w:val="17"/>
               </w:rPr>
-              <w:t># blood tests - admitted</w:t>
+              <w:t>Number of blood tests and admission</w:t>
             </w:r>
           </w:p>
         </w:tc>
@@ -2108,6 +2015,7 @@
           </w:tcPr>
           <w:p>
             <w:pPr>
+              <w:keepNext/>
               <w:spacing w:after="0"/>
               <w:jc w:val="center"/>
             </w:pPr>
@@ -2122,10 +2030,11 @@
         </w:tc>
         <w:tc>
           <w:tcPr>
-            <w:tcW w:type="dxa" w:w="4464"/>
+            <w:tcW w:type="dxa" w:w="4536"/>
           </w:tcPr>
           <w:p>
             <w:pPr>
+              <w:keepNext/>
               <w:spacing w:after="0"/>
             </w:pPr>
             <w:r>
@@ -2133,7 +2042,7 @@
                 <w:b w:val="0"/>
                 <w:sz w:val="17"/>
               </w:rPr>
-              <w:t>Workup intensity signals severity</w:t>
+              <w:t>More extensive workups among admitted patients</w:t>
             </w:r>
           </w:p>
         </w:tc>
@@ -2141,10 +2050,11 @@
       <w:tr>
         <w:tc>
           <w:tcPr>
-            <w:tcW w:type="dxa" w:w="3600"/>
+            <w:tcW w:type="dxa" w:w="4104"/>
           </w:tcPr>
           <w:p>
             <w:pPr>
+              <w:keepNext/>
               <w:spacing w:after="0"/>
             </w:pPr>
             <w:r>
@@ -2152,7 +2062,7 @@
                 <w:b w:val="0"/>
                 <w:sz w:val="17"/>
               </w:rPr>
-              <w:t>Triage level - # blood tests</w:t>
+              <w:t>Triage level and number of blood tests</w:t>
             </w:r>
           </w:p>
         </w:tc>
@@ -2162,6 +2072,7 @@
           </w:tcPr>
           <w:p>
             <w:pPr>
+              <w:keepNext/>
               <w:spacing w:after="0"/>
               <w:jc w:val="center"/>
             </w:pPr>
@@ -2176,10 +2087,11 @@
         </w:tc>
         <w:tc>
           <w:tcPr>
-            <w:tcW w:type="dxa" w:w="4464"/>
+            <w:tcW w:type="dxa" w:w="4536"/>
           </w:tcPr>
           <w:p>
             <w:pPr>
+              <w:keepNext/>
               <w:spacing w:after="0"/>
             </w:pPr>
             <w:r>
@@ -2187,7 +2099,7 @@
                 <w:b w:val="0"/>
                 <w:sz w:val="17"/>
               </w:rPr>
-              <w:t>Urgent patients get more tests</w:t>
+              <w:t>More testing for more urgent patients</w:t>
             </w:r>
           </w:p>
         </w:tc>
@@ -2195,10 +2107,11 @@
       <w:tr>
         <w:tc>
           <w:tcPr>
-            <w:tcW w:type="dxa" w:w="3600"/>
+            <w:tcW w:type="dxa" w:w="4104"/>
           </w:tcPr>
           <w:p>
             <w:pPr>
+              <w:keepNext/>
               <w:spacing w:after="0"/>
             </w:pPr>
             <w:r>
@@ -2206,7 +2119,7 @@
                 <w:b w:val="0"/>
                 <w:sz w:val="17"/>
               </w:rPr>
-              <w:t># chronic conditions - admitted</w:t>
+              <w:t>Number of chronic conditions and admission</w:t>
             </w:r>
           </w:p>
         </w:tc>
@@ -2216,6 +2129,7 @@
           </w:tcPr>
           <w:p>
             <w:pPr>
+              <w:keepNext/>
               <w:spacing w:after="0"/>
               <w:jc w:val="center"/>
             </w:pPr>
@@ -2230,10 +2144,11 @@
         </w:tc>
         <w:tc>
           <w:tcPr>
-            <w:tcW w:type="dxa" w:w="4464"/>
+            <w:tcW w:type="dxa" w:w="4536"/>
           </w:tcPr>
           <w:p>
             <w:pPr>
+              <w:keepNext/>
               <w:spacing w:after="0"/>
             </w:pPr>
             <w:r>
@@ -2241,7 +2156,7 @@
                 <w:b w:val="0"/>
                 <w:sz w:val="17"/>
               </w:rPr>
-              <w:t>Complex patients are admitted more</w:t>
+              <w:t>Patients with more conditions admitted more often</w:t>
             </w:r>
           </w:p>
         </w:tc>
@@ -2249,10 +2164,11 @@
       <w:tr>
         <w:tc>
           <w:tcPr>
-            <w:tcW w:type="dxa" w:w="3600"/>
+            <w:tcW w:type="dxa" w:w="4104"/>
           </w:tcPr>
           <w:p>
             <w:pPr>
+              <w:keepNext/>
               <w:spacing w:after="0"/>
             </w:pPr>
             <w:r>
@@ -2260,7 +2176,7 @@
                 <w:b w:val="0"/>
                 <w:sz w:val="17"/>
               </w:rPr>
-              <w:t>Length of visit - # blood tests</w:t>
+              <w:t>Length of visit and number of blood tests</w:t>
             </w:r>
           </w:p>
         </w:tc>
@@ -2270,6 +2186,7 @@
           </w:tcPr>
           <w:p>
             <w:pPr>
+              <w:keepNext/>
               <w:spacing w:after="0"/>
               <w:jc w:val="center"/>
             </w:pPr>
@@ -2284,10 +2201,11 @@
         </w:tc>
         <w:tc>
           <w:tcPr>
-            <w:tcW w:type="dxa" w:w="4464"/>
+            <w:tcW w:type="dxa" w:w="4536"/>
           </w:tcPr>
           <w:p>
             <w:pPr>
+              <w:keepNext/>
               <w:spacing w:after="0"/>
             </w:pPr>
             <w:r>
@@ -2295,7 +2213,7 @@
                 <w:b w:val="0"/>
                 <w:sz w:val="17"/>
               </w:rPr>
-              <w:t>Diagnostics lengthen stays</w:t>
+              <w:t>Longer visits involve more testing</w:t>
             </w:r>
           </w:p>
         </w:tc>
@@ -2303,10 +2221,11 @@
       <w:tr>
         <w:tc>
           <w:tcPr>
-            <w:tcW w:type="dxa" w:w="3600"/>
+            <w:tcW w:type="dxa" w:w="4104"/>
           </w:tcPr>
           <w:p>
             <w:pPr>
+              <w:keepNext/>
               <w:spacing w:after="0"/>
             </w:pPr>
             <w:r>
@@ -2314,7 +2233,7 @@
                 <w:b w:val="0"/>
                 <w:sz w:val="17"/>
               </w:rPr>
-              <w:t>Wait - length of visit</w:t>
+              <w:t>Wait and length of visit</w:t>
             </w:r>
           </w:p>
         </w:tc>
@@ -2324,6 +2243,7 @@
           </w:tcPr>
           <w:p>
             <w:pPr>
+              <w:keepNext/>
               <w:spacing w:after="0"/>
               <w:jc w:val="center"/>
             </w:pPr>
@@ -2338,10 +2258,11 @@
         </w:tc>
         <w:tc>
           <w:tcPr>
-            <w:tcW w:type="dxa" w:w="4464"/>
+            <w:tcW w:type="dxa" w:w="4536"/>
           </w:tcPr>
           <w:p>
             <w:pPr>
+              <w:keepNext/>
               <w:spacing w:after="0"/>
             </w:pPr>
             <w:r>
@@ -2349,7 +2270,7 @@
                 <w:b w:val="0"/>
                 <w:sz w:val="17"/>
               </w:rPr>
-              <w:t>Front-end delays carry through</w:t>
+              <w:t>Longer waits accompany longer visits</w:t>
             </w:r>
           </w:p>
         </w:tc>
@@ -2357,10 +2278,11 @@
       <w:tr>
         <w:tc>
           <w:tcPr>
-            <w:tcW w:type="dxa" w:w="3600"/>
+            <w:tcW w:type="dxa" w:w="4104"/>
           </w:tcPr>
           <w:p>
             <w:pPr>
+              <w:keepNext/>
               <w:spacing w:after="0"/>
             </w:pPr>
             <w:r>
@@ -2368,7 +2290,7 @@
                 <w:b w:val="0"/>
                 <w:sz w:val="17"/>
               </w:rPr>
-              <w:t>Arrived by ambulance - admitted</w:t>
+              <w:t>Ambulance arrival and admission</w:t>
             </w:r>
           </w:p>
         </w:tc>
@@ -2378,6 +2300,7 @@
           </w:tcPr>
           <w:p>
             <w:pPr>
+              <w:keepNext/>
               <w:spacing w:after="0"/>
               <w:jc w:val="center"/>
             </w:pPr>
@@ -2392,7 +2315,27 @@
         </w:tc>
         <w:tc>
           <w:tcPr>
-            <w:tcW w:type="dxa" w:w="4464"/>
+            <w:tcW w:type="dxa" w:w="4536"/>
+          </w:tcPr>
+          <w:p>
+            <w:pPr>
+              <w:keepNext/>
+              <w:spacing w:after="0"/>
+            </w:pPr>
+            <w:r>
+              <w:rPr>
+                <w:b w:val="0"/>
+                <w:sz w:val="17"/>
+              </w:rPr>
+              <w:t>Ambulance arrivals admitted more often</w:t>
+            </w:r>
+          </w:p>
+        </w:tc>
+      </w:tr>
+      <w:tr>
+        <w:tc>
+          <w:tcPr>
+            <w:tcW w:type="dxa" w:w="4104"/>
           </w:tcPr>
           <w:p>
             <w:pPr>
@@ -2403,26 +2346,7 @@
                 <w:b w:val="0"/>
                 <w:sz w:val="17"/>
               </w:rPr>
-              <w:t>Ambulance arrivals are sicker</w:t>
-            </w:r>
-          </w:p>
-        </w:tc>
-      </w:tr>
-      <w:tr>
-        <w:tc>
-          <w:tcPr>
-            <w:tcW w:type="dxa" w:w="3600"/>
-          </w:tcPr>
-          <w:p>
-            <w:pPr>
-              <w:spacing w:after="0"/>
-            </w:pPr>
-            <w:r>
-              <w:rPr>
-                <w:b w:val="0"/>
-                <w:sz w:val="17"/>
-              </w:rPr>
-              <w:t>Sex, ethnicity, pain - any outcome</w:t>
+              <w:t>Sex, ethnicity or pain score and any outcome</w:t>
             </w:r>
           </w:p>
         </w:tc>
@@ -2446,7 +2370,7 @@
         </w:tc>
         <w:tc>
           <w:tcPr>
-            <w:tcW w:type="dxa" w:w="4464"/>
+            <w:tcW w:type="dxa" w:w="4536"/>
           </w:tcPr>
           <w:p>
             <w:pPr>
@@ -2457,7 +2381,7 @@
                 <w:b w:val="0"/>
                 <w:sz w:val="17"/>
               </w:rPr>
-              <w:t>No meaningful association</w:t>
+              <w:t>Little linear association</w:t>
             </w:r>
           </w:p>
         </w:tc>
@@ -2465,19 +2389,20 @@
     </w:tbl>
     <w:p>
       <w:pPr>
-        <w:spacing w:after="0"/>
+        <w:spacing w:after="40"/>
       </w:pPr>
     </w:p>
     <w:p>
       <w:pPr>
+        <w:keepNext/>
         <w:spacing w:after="0"/>
         <w:jc w:val="center"/>
       </w:pPr>
       <w:r>
         <w:drawing>
           <wp:inline xmlns:a="http://schemas.openxmlformats.org/drawingml/2006/main" xmlns:pic="http://schemas.openxmlformats.org/drawingml/2006/picture">
-            <wp:extent cx="5760720" cy="1920240"/>
-            <wp:docPr id="6" name="Picture 6"/>
+            <wp:extent cx="4846320" cy="1615440"/>
+            <wp:docPr id="5" name="Picture 5"/>
             <wp:cNvGraphicFramePr>
               <a:graphicFrameLocks noChangeAspect="1"/>
             </wp:cNvGraphicFramePr>
@@ -2489,7 +2414,7 @@
                     <pic:cNvPicPr/>
                   </pic:nvPicPr>
                   <pic:blipFill>
-                    <a:blip r:embed="rId14"/>
+                    <a:blip r:embed="rId13"/>
                     <a:stretch>
                       <a:fillRect/>
                     </a:stretch>
@@ -2497,7 +2422,7 @@
                   <pic:spPr>
                     <a:xfrm>
                       <a:off x="0" y="0"/>
-                      <a:ext cx="5760720" cy="1920240"/>
+                      <a:ext cx="4846320" cy="1615440"/>
                     </a:xfrm>
                     <a:prstGeom prst="rect"/>
                   </pic:spPr>
@@ -2510,66 +2435,25 @@
     </w:p>
     <w:p>
       <w:pPr>
-        <w:spacing w:after="120"/>
+        <w:spacing w:after="180"/>
         <w:jc w:val="center"/>
       </w:pPr>
       <w:r>
         <w:rPr>
-          <w:b/>
+          <w:b w:val="0"/>
+          <w:i/>
           <w:color w:val="52514E"/>
           <w:sz w:val="17"/>
         </w:rPr>
-        <w:t>Figure 4. Admission rate (left) and median wait (right) by triage level, weighted</w:t>
+        <w:t>Figure 4. Weighted admission rate and median recorded wait by triage level (visits with triage levels 1-5; waits among visits with a recorded wait)</w:t>
       </w:r>
     </w:p>
     <w:p>
       <w:r>
         <w:rPr>
-          <w:b/>
-        </w:rPr>
-        <w:t>Outcomes.</w:t>
-      </w:r>
-      <w:r>
-        <w:rPr>
           <w:b w:val="0"/>
         </w:rPr>
-        <w:t xml:space="preserve"> Deaths are too rare for correlations to capture: only 28 sampled visits died in the ED (0.10% weighted), 7 were dead on arrival (0.04%), and 40 of 1,752 admitted patients died in hospital (2.6%). Their correlations are near zero even where the relationship is strong, so we compare rates across groups instead. By triage level, the admission rate falls from </w:t>
-      </w:r>
-      <w:r>
-        <w:rPr>
-          <w:b/>
-        </w:rPr>
-        <w:t>33% (immediate) to 2-3% (semi- and nonurgent)</w:t>
-      </w:r>
-      <w:r>
-        <w:rPr>
-          <w:b w:val="0"/>
-        </w:rPr>
-        <w:t xml:space="preserve">, </w:t>
-      </w:r>
-      <w:r>
-        <w:rPr>
-          <w:b/>
-        </w:rPr>
-        <w:t>6.4% of immediate patients die in the ED</w:t>
-      </w:r>
-      <w:r>
-        <w:rPr>
-          <w:b w:val="0"/>
-        </w:rPr>
-        <w:t xml:space="preserve">, and 41% of them arrive by ambulance. By age, admission rises from 2.5% (under 15) to 29.1% (75+). The operational surprise: </w:t>
-      </w:r>
-      <w:r>
-        <w:rPr>
-          <w:b/>
-        </w:rPr>
-        <w:t>median waits are 14 minutes for immediate patients but 18-20 minutes for every other level</w:t>
-      </w:r>
-      <w:r>
-        <w:rPr>
-          <w:b w:val="0"/>
-        </w:rPr>
-        <w:t>, so triage fast-tracks only the sickest, and emergent patients wait as long as nonurgent ones. These are associations, not causal effects: age simultaneously drives chronic burden, payer and treatment intensity.</w:t>
+        <w:t>Admission falls from 33% at triage level 1 to 2-3% at levels 4-5 (9.0% overall), consistent with triage identifying sicker patients. Recorded median waits are 14 minutes at level 1 but 18-20 minutes at every other level. That comparison is descriptive: 15% of visits lack a recorded wait, missingness differs by triage status, and case mix and hospital differences are not controlled. Whether emergent (level 2) patients wait longer than intended is a question for hospital-level timestamp data rather than something these medians establish. Deaths are too rare to analyze by subgroup: the sample contains 28 ED deaths and 7 patients dead on arrival, below the 30-record threshold NCHS uses for reliable estimates (codebook pp.8-9). We therefore report only the overall weighted rates (0.10% and 0.04%) and treat them as unreliable. Among admitted patients with a known discharge status, 40 of 1,752 died in hospital (2.6% weighted).</w:t>
       </w:r>
     </w:p>
     <w:p>
@@ -2577,7 +2461,7 @@
         <w:pStyle w:val="Heading1"/>
       </w:pPr>
       <w:r>
-        <w:t>7. Implications for hospital management, and limitations</w:t>
+        <w:t>7. Implications for hospital managers, and limitations</w:t>
       </w:r>
     </w:p>
     <w:p>
@@ -2587,15 +2471,9 @@
       </w:pPr>
       <w:r>
         <w:rPr>
-          <w:b/>
-        </w:rPr>
-        <w:t>Capacity:</w:t>
-      </w:r>
-      <w:r>
-        <w:rPr>
           <w:b w:val="0"/>
         </w:rPr>
-        <w:t xml:space="preserve"> staff to a 10am-8pm plateau with a Monday premium. Throughput time (a median 2.6-hour stay with a long tail) is as important a capacity lever as arrival volume.</w:t>
+        <w:t>Capacity: arrivals hold near peak from 10am to 8pm and run about 25% higher on Mondays than Sundays, and the median visit lasts 2.6 hours, so time in the department is as important a planning variable as arrival volume.</w:t>
       </w:r>
     </w:p>
     <w:p>
@@ -2605,15 +2483,9 @@
       </w:pPr>
       <w:r>
         <w:rPr>
-          <w:b/>
-        </w:rPr>
-        <w:t>Triage and flow:</w:t>
-      </w:r>
-      <w:r>
-        <w:rPr>
           <w:b w:val="0"/>
         </w:rPr>
-        <w:t xml:space="preserve"> emergent (level 2) patients wait as long as nonurgent ones. A fast track for levels 4-5 could free provider time for level 2-3 patients.</w:t>
+        <w:t>Patient flow: recorded median waits for emergent (level 2) patients match those for nonurgent patients, a pattern worth checking against local timestamp data.</w:t>
       </w:r>
     </w:p>
     <w:p>
@@ -2623,15 +2495,9 @@
       </w:pPr>
       <w:r>
         <w:rPr>
-          <w:b/>
-        </w:rPr>
-        <w:t>Finance:</w:t>
-      </w:r>
-      <w:r>
-        <w:rPr>
           <w:b w:val="0"/>
         </w:rPr>
-        <w:t xml:space="preserve"> 55% public payers and 11% uninsured or charity. Accurate payer capture (10.8% unknown) and Medicaid contracting matter for margins.</w:t>
+        <w:t>Finance: public programs are the expected payer for about half of all visits; the effect on margins depends on reimbursement and collections not captured here.</w:t>
       </w:r>
     </w:p>
     <w:p>
@@ -2641,56 +2507,24 @@
       </w:pPr>
       <w:r>
         <w:rPr>
-          <w:b/>
-        </w:rPr>
-        <w:t>Chronic care:</w:t>
-      </w:r>
-      <w:r>
-        <w:rPr>
           <w:b w:val="0"/>
         </w:rPr>
-        <w:t xml:space="preserve"> nearly half of visits involve chronic disease. Care coordination and follow-up could shift avoidable visits to cheaper settings.</w:t>
+        <w:t>Limitations: no design-based standard errors; wait-time missingness varies by triage status and region; rare outcomes fall below NCHS's reliability threshold; condition flags depend on documentation; and 2015 form changes limit comparisons with earlier years.</w:t>
       </w:r>
     </w:p>
     <w:p>
-      <w:pPr>
-        <w:pStyle w:val="ListBullet"/>
-        <w:spacing w:after="40"/>
-      </w:pPr>
-      <w:r>
-        <w:rPr>
-          <w:b/>
-        </w:rPr>
-        <w:t>Limitations:</w:t>
-      </w:r>
-      <w:r>
-        <w:rPr>
-          <w:b w:val="0"/>
-        </w:rPr>
-        <w:t xml:space="preserve"> these are weighted point estimates without survey-design standard errors (CSTRATM/CPSUM; NCHS advises testing at the 1% level). Wait-time missingness is not random. Chronic conditions such as obesity are likely under-recorded, and the 2015 form changes limit comparisons with earlier years.</w:t>
-      </w:r>
-    </w:p>
-    <w:p>
-      <w:r>
-        <w:rPr>
-          <w:b/>
-          <w:color w:val="52514E"/>
-          <w:sz w:val="18"/>
-        </w:rPr>
-        <w:t>AI use.</w:t>
-      </w:r>
       <w:r>
         <w:rPr>
           <w:b w:val="0"/>
           <w:color w:val="52514E"/>
           <w:sz w:val="18"/>
         </w:rPr>
-        <w:t xml:space="preserve"> As the course requires, we used AI throughout. The analysis code was written with Claude (Anthropic) through Claude Code, directed by the group question by question. We ran every step ourselves on the Yale HPC cluster, reviewed each output before moving on, and verified results against published NCHS figures (20 of 20 checks pass). This write-up and the slides were drafted with AI assistance from those verified outputs, then reviewed and edited by the group.</w:t>
+        <w:t>AI use. The course requires AI use. We used an AI coding assistant (Claude Code) to write and debug the analysis code and to draft this report and the slides. We ran every step on the Yale HPC cluster, reviewed each output before continuing, and compared key estimates with figures published by NCHS, as described in Section 1.</w:t>
       </w:r>
     </w:p>
     <w:sectPr>
       <w:pgSz w:w="12240" w:h="15840"/>
-      <w:pgMar w:top="864" w:right="1080" w:bottom="864" w:left="1080" w:header="720" w:footer="720" w:gutter="0"/>
+      <w:pgMar w:top="936" w:right="1080" w:bottom="936" w:left="1080" w:header="720" w:footer="720" w:gutter="0"/>
       <w:cols w:space="720"/>
       <w:docGrid w:linePitch="360"/>
     </w:sectPr>
@@ -3066,7 +2900,7 @@
     </w:pPr>
     <w:rPr>
       <w:rFonts w:ascii="Calibri" w:hAnsi="Calibri" w:eastAsia="Calibri"/>
-      <w:sz w:val="20"/>
+      <w:sz w:val="19"/>
     </w:rPr>
   </w:style>
   <w:style w:type="paragraph" w:styleId="Header">
@@ -3124,7 +2958,7 @@
     <w:pPr>
       <w:keepNext/>
       <w:keepLines/>
-      <w:spacing w:before="160" w:after="60"/>
+      <w:spacing w:before="220" w:after="60"/>
       <w:outlineLvl w:val="0"/>
     </w:pPr>
     <w:rPr>
@@ -3148,15 +2982,15 @@
     <w:pPr>
       <w:keepNext/>
       <w:keepLines/>
-      <w:spacing w:before="100" w:after="60"/>
+      <w:spacing w:before="200" w:after="0"/>
       <w:outlineLvl w:val="1"/>
     </w:pPr>
     <w:rPr>
-      <w:rFonts w:asciiTheme="majorHAnsi" w:eastAsiaTheme="majorEastAsia" w:hAnsiTheme="majorHAnsi" w:cstheme="majorBidi" w:ascii="Calibri" w:hAnsi="Calibri"/>
+      <w:rFonts w:asciiTheme="majorHAnsi" w:eastAsiaTheme="majorEastAsia" w:hAnsiTheme="majorHAnsi" w:cstheme="majorBidi"/>
       <w:b/>
       <w:bCs/>
-      <w:color w:val="1F3A5F"/>
-      <w:sz w:val="22"/>
+      <w:color w:val="4F81BD" w:themeColor="accent1"/>
+      <w:sz w:val="26"/>
       <w:szCs w:val="26"/>
     </w:rPr>
   </w:style>

</xml_diff>

<commit_message>
HW1: final QC pass on write-up and slides
- Q9 paragraph kept on one page; Figure 3 caption trimmed
- Q4 weighted totals (Mon 22.45M vs Sun 18.00M; 8.59M at 6pm) and full Q5 distribution
- Wait-time missingness split: 15.2% blank + 3.4% not applicable = 18.6% no usable wait
- Raw vs capped means distinguished; weighting wording made precise
- Slide 3 title says expected payer; slide 4 reframed on chronic burden and medications
- Visit-level age wording, overlapping medication counts noted, in-hospital deaths
  descriptive only, generic AI-use disclosure in the report

Co-Authored-By: Claude Opus 5.5 <noreply@anthropic.com>
</commit_message>
<xml_diff>
--- a/hw1/report/MGT634_HW1_NHAMCS_writeup.docx
+++ b/hw1/report/MGT634_HW1_NHAMCS_writeup.docx
@@ -1421,7 +1421,7 @@
         <w:rPr>
           <w:b w:val="0"/>
         </w:rPr>
-        <w:t>The median patient is 34 years old, 55% of visits are by women and 16.5% by Hispanic patients (weighted). Half of patients with a recorded wait saw a provider within 18 minutes, but the mean wait is roughly twice the median, so a minority of long waits pulls the average up. The median visit lasts 154 minutes (2.6 hours) and the mean about 214 minutes. That long right tail matters for capacity, because long stays occupy beds and staff time. As a rough illustration, Little's law (average patients present = arrival rate x average time in the department) implies about 55,700 patients in U.S. EDs at a typical moment, or roughly 12 per ED across the 4,820 EDs NCHS estimates (codebook p.120), assuming steady arrivals.</w:t>
+        <w:t>The median visit is by a patient aged 34; 55% of visits are by women and 16.5% by Hispanic patients (weighted). Half of patients with a recorded wait saw a provider within 18 minutes, but the mean wait is roughly twice the median, so a minority of long waits pulls the average up. The median visit lasts 154 minutes (2.6 hours) and the mean about 214 minutes. That long right tail matters for capacity, because long stays occupy beds and staff time. As a rough illustration, Little's law (average patients present = arrival rate x average time in the department) implies about 55,700 patients in U.S. EDs at a typical moment, or roughly 12 per ED across the 4,820 EDs NCHS estimates (codebook p.120), assuming steady arrivals.</w:t>
       </w:r>
     </w:p>
     <w:p>
@@ -1563,7 +1563,7 @@
         <w:rPr>
           <w:b w:val="0"/>
         </w:rPr>
-        <w:t>Because 2015 had 53 Thursdays and 52 of every other weekday, we compare days as average visits per day. Monday is the busiest day (432,000 visits per day) and Sunday the quietest (346,000), a 25% difference, with volume declining from Monday through Thursday. By hour, arrivals are lowest between 3am and 6am (about 1.3-1.4% of daily arrivals per hour), climb from 7am, and stay near their peak from 10am to 8pm; the single busiest hour is 6pm (6.3%). The peak hour receives 4.7 times as many arrivals as the quietest, and 69% of patients arrive between 10am and 10pm.</w:t>
+        <w:t>Because 2015 had 53 Thursdays and 52 of every other weekday, we compare days as average visits per day. Monday is the busiest day (432,000 visits per day) and Sunday the quietest (346,000), a 25% difference, with volume declining from Monday through Thursday. Over the year that is 22.45 million weighted Monday visits versus 18.00 million on Sundays. By hour, arrivals are lowest between 3am and 6am (about 1.3-1.4% of daily arrivals per hour), climb from 7am, and stay near their peak from 10am to 8pm; the busiest hour is 6pm (6.3%, 8.59 million arrivals over 2015). The peak hour receives 4.7 times as many arrivals as the quietest, and 69% of patients arrive between 10am and 10pm.</w:t>
       </w:r>
     </w:p>
     <w:p>
@@ -1587,7 +1587,7 @@
         <w:rPr>
           <w:b w:val="0"/>
         </w:rPr>
-        <w:t>PAYTYPER is the primary expected source of payment, chosen by an NCHS hierarchy when a visit lists several; it is not a record of revenue actually collected. Across all visits (weighted), Medicaid/CHIP is the expected payer for 31.2%, private insurance 27.6%, Medicare 17.7% and self-pay 9.0%; for 10.8% the payer is blank or unknown. Medicaid and Medicare together account for 48.9% of all visits and 54.8% of the 89.2% of visits with a known expected payer (Medicaid 34.9%, private 30.9%, Medicare 19.9%, self-pay 10.1%; self-pay and no charge together 11.0%). Age drives much of this mix (Figure 2): Medicaid is the expected payer for 65% of visits by children, Medicare for 78-87% of visits by patients 65 and older, and self-pay peaks at 17.5% among 25-44-year-olds.</w:t>
+        <w:t>PAYTYPER is the primary expected source of payment, chosen by an NCHS hierarchy when a visit lists several; it is not a record of revenue actually collected. Across all visits (weighted), Medicaid/CHIP is the expected payer for 31.2%, private insurance 27.6%, Medicare 17.7% and self-pay 9.0%, other 2.2%, no charge 0.8% and workers' compensation 0.7%; for a further 10.8% the payer is blank or unknown. Medicaid and Medicare together account for 48.9% of all visits and 54.8% of the 89.2% of visits with a known expected payer (Medicaid 34.9%, private 30.9%, Medicare 19.9%, self-pay 10.1%; self-pay and no charge together 11.0%). Age drives much of this mix (Figure 2): Medicaid is the expected payer for 65% of visits by children, Medicare for 78-87% of visits by patients 65 and older, and self-pay peaks at 17.5% among 25-44-year-olds.</w:t>
       </w:r>
     </w:p>
     <w:p>
@@ -1599,7 +1599,7 @@
       <w:r>
         <w:drawing>
           <wp:inline xmlns:a="http://schemas.openxmlformats.org/drawingml/2006/main" xmlns:pic="http://schemas.openxmlformats.org/drawingml/2006/picture">
-            <wp:extent cx="3657600" cy="1828800"/>
+            <wp:extent cx="3383280" cy="1691640"/>
             <wp:docPr id="3" name="Picture 3"/>
             <wp:cNvGraphicFramePr>
               <a:graphicFrameLocks noChangeAspect="1"/>
@@ -1620,7 +1620,7 @@
                   <pic:spPr>
                     <a:xfrm>
                       <a:off x="0" y="0"/>
-                      <a:ext cx="3657600" cy="1828800"/>
+                      <a:ext cx="3383280" cy="1691640"/>
                     </a:xfrm>
                     <a:prstGeom prst="rect"/>
                   </pic:spPr>
@@ -1671,7 +1671,7 @@
       <w:r>
         <w:drawing>
           <wp:inline xmlns:a="http://schemas.openxmlformats.org/drawingml/2006/main" xmlns:pic="http://schemas.openxmlformats.org/drawingml/2006/picture">
-            <wp:extent cx="4480560" cy="1680210"/>
+            <wp:extent cx="4206240" cy="1577340"/>
             <wp:docPr id="4" name="Picture 4"/>
             <wp:cNvGraphicFramePr>
               <a:graphicFrameLocks noChangeAspect="1"/>
@@ -1692,7 +1692,7 @@
                   <pic:spPr>
                     <a:xfrm>
                       <a:off x="0" y="0"/>
-                      <a:ext cx="4480560" cy="1680210"/>
+                      <a:ext cx="4206240" cy="1577340"/>
                     </a:xfrm>
                     <a:prstGeom prst="rect"/>
                   </pic:spPr>
@@ -1715,7 +1715,7 @@
           <w:color w:val="52514E"/>
           <w:sz w:val="17"/>
         </w:rPr>
-        <w:t>Figure 3. Hypertension and diabetes are the most commonly recorded chronic conditions: weighted % of visits with the chronic-condition section completed (98.4% of records). "Any diabetes" combines three checkboxes; type 2 alone is 4.7%. Chart re-plotted from the verified Q6 output.</w:t>
+        <w:t>Figure 3. Hypertension and diabetes are the most commonly recorded chronic conditions: weighted % of visits with the chronic-condition section completed (98.4% of records). "Any diabetes" combines three checkboxes; type 2 alone is 4.7%.</w:t>
       </w:r>
     </w:p>
     <w:p>
@@ -1757,10 +1757,13 @@
         <w:rPr>
           <w:b w:val="0"/>
         </w:rPr>
-        <w:t xml:space="preserve"> Imaging is used at 47.0% of all visits (weighted): X-ray 33.7%, CT 16.5%, ultrasound 4.4% and MRI 0.7%. Use rises with age, from 29% of visits by children to 70% at 75 and older, and is higher for injury visits (54%) than other visits (44%). At least one blood test is ordered at 42.4% of visits. Among those visits, a complete blood count is by far the most common test (85.4%), followed by the comprehensive (55.3%) and basic (25.2%) metabolic panels, with 3.2 different tests per visit on average. Standalone glucose, BUN/creatinine and electrolyte orders are less common partly because the metabolic panels include those tests; the 2015 form added separate panel checkboxes (codebook pp.3-4).</w:t>
+        <w:t xml:space="preserve"> Imaging is used at 47.0% of all visits (weighted): X-ray 33.7%, CT 16.5%, ultrasound 4.4% and MRI 0.7%. Use rises with age, from 29% of visits by children to 70% at 75 and older, and is higher for injury visits (54%) than other visits (44%). At least one blood test is ordered at 42.4% of visits. Among those visits, a complete blood count is by far the most common test (85.4%), followed by the comprehensive (55.3%) and basic (25.2%) metabolic panels, with 3.2 different tests per visit on average. Standalone glucose, BUN/creatinine and electrolyte orders are less common partly because the panels include those tests (codebook pp.3-4).</w:t>
       </w:r>
     </w:p>
     <w:p>
+      <w:pPr>
+        <w:keepLines/>
+      </w:pPr>
       <w:r>
         <w:rPr>
           <w:b/>
@@ -1771,7 +1774,7 @@
         <w:rPr>
           <w:b w:val="0"/>
         </w:rPr>
-        <w:t xml:space="preserve"> The weighted mean is 2.49 medications per visit and the median is 2: 20.9% of visits involve no medication, 41.9% involve one or two and 37.2% involve three or more, matching the NCHS distribution (Table 1). On average 1.62 medications are given in the ED and 1.08 prescribed at discharge. The count rises with patient complexity, from 2.0 for visits with no recorded chronic condition to 3.8 for visits with three or more, and peaks at 3.1 for ages 45-64. With more than a third of visits involving three or more medications, medication reconciliation and interaction checking are a routine part of ED care rather than an edge case.</w:t>
+        <w:t xml:space="preserve"> The weighted mean is 2.49 medications per visit and the median is 2; 20.9% of visits involve none, 41.9% one or two and 37.2% three or more, matching NCHS (Table 1). On average 1.62 are given in the ED and 1.08 prescribed at discharge (a drug can be both, so these overlap). The count rises with complexity, from 2.0 with no recorded chronic condition to 3.8 with three or more, and peaks at 3.1 for ages 45-64, so medication reconciliation and interaction checking are routine ED work.</w:t>
       </w:r>
     </w:p>
     <w:p>
@@ -2453,7 +2456,7 @@
         <w:rPr>
           <w:b w:val="0"/>
         </w:rPr>
-        <w:t>Admission falls from 33% at triage level 1 to 2-3% at levels 4-5 (9.0% overall), consistent with triage identifying sicker patients. Recorded median waits are 14 minutes at level 1 but 18-20 minutes at every other level. That comparison is descriptive: 15% of visits lack a recorded wait, missingness differs by triage status, and case mix and hospital differences are not controlled. Whether emergent (level 2) patients wait longer than intended is a question for hospital-level timestamp data rather than something these medians establish. Deaths are too rare to analyze by subgroup: the sample contains 28 ED deaths and 7 patients dead on arrival, below the 30-record threshold NCHS uses for reliable estimates (codebook pp.8-9). We therefore report only the overall weighted rates (0.10% and 0.04%) and treat them as unreliable. Among admitted patients with a known discharge status, 40 of 1,752 died in hospital (2.6% weighted).</w:t>
+        <w:t>Admission falls from 33% at triage level 1 to 2-3% at levels 4-5 (9.0% overall), consistent with triage identifying sicker patients. Recorded median waits are 14 minutes at level 1 but 18-20 minutes at every other level. That comparison is descriptive: wait time is blank for 15.2% of sampled visits and not applicable (not seen by a provider) for another 3.4%, so 18.6% have no usable wait; missingness differs by triage status and region; and case mix and hospital differences are not controlled. Whether emergent (level 2) patients wait longer than intended is a question for hospital-level timestamp data rather than something these medians establish. Deaths are too rare to analyze by subgroup: the sample contains 28 ED deaths and 7 patients dead on arrival, below the 30-record threshold NCHS uses for reliable estimates (codebook pp.8-9). We therefore report only the overall weighted rates (0.10% and 0.04%) and treat them as unreliable. Among admitted patients with a known discharge status, 40 of 1,752 died in hospital (2.6% weighted); with no standard errors, we treat this as descriptive only.</w:t>
       </w:r>
     </w:p>
     <w:p>
@@ -2519,7 +2522,7 @@
           <w:color w:val="52514E"/>
           <w:sz w:val="18"/>
         </w:rPr>
-        <w:t>AI use. The course requires AI use. We used an AI coding assistant (Claude Code) to write and debug the analysis code and to draft this report and the slides. We ran every step on the Yale HPC cluster, reviewed each output before continuing, and compared key estimates with figures published by NCHS, as described in Section 1.</w:t>
+        <w:t>AI use. The course requires AI use. We used an AI coding assistant to write and debug the analysis code and to draft this report and the slides. We ran every step on the Yale HPC cluster, reviewed each output before continuing, and compared key estimates with figures published by NCHS, as described in Section 1.</w:t>
       </w:r>
     </w:p>
     <w:sectPr>

</xml_diff>

<commit_message>
HW1 write-up: bold answer tags for every assignment part (Q1a-Q10)
Team request so the grader can find each answer; section 7 and two sentences
trimmed to stay at 4 pages. Numbers unchanged.

Co-Authored-By: Claude Opus 5.5 <noreply@anthropic.com>
</commit_message>
<xml_diff>
--- a/hw1/report/MGT634_HW1_NHAMCS_writeup.docx
+++ b/hw1/report/MGT634_HW1_NHAMCS_writeup.docx
@@ -53,9 +53,27 @@
     <w:p>
       <w:r>
         <w:rPr>
+          <w:b/>
+        </w:rPr>
+        <w:t>Q1(a): The file has 21,061 rows and 1,031 columns. Q1(c): each row is one sampled ED visit (one Patient Record Form), not a patient</w:t>
+      </w:r>
+      <w:r>
+        <w:rPr>
           <w:b w:val="0"/>
         </w:rPr>
-        <w:t>The NCHS public-use file has 21,061 rows and 1,031 columns. Each row is one sampled ED visit (one Patient Record Form), not a patient, so the same person can appear more than once. Hospital code plus patient code uniquely identifies every row, and the visits come from 248 EDs (a median of 94 sampled visits each). The unweighted count is therefore 21,061 visits. Summing the patient visit weight PATWT gives 136,943,181 estimated U.S. ED visits in 2015, the total NCHS reports (codebook p.28) and well above 100 million. The weights are uneven (117 to 42,002; the 10% of rows with the largest weights carry 28.7% of weighted visits), and the sample does not mirror the country: the Northeast is 20.4% of rows but 17.3% of weighted visits, the South 33.3% versus 37.8%. We therefore weight every total, share and rate. We report weighted point estimates only; we did not compute design-based standard errors (strata CSTRATM, clusters CPSUM), so small differences should not be over-read.</w:t>
+        <w:t xml:space="preserve">, so the same person can appear more than once. Hospital code plus patient code uniquely identifies every row, and the visits come from 248 EDs (a median of 94 sampled visits each). </w:t>
+      </w:r>
+      <w:r>
+        <w:rPr>
+          <w:b/>
+        </w:rPr>
+        <w:t>Q2(a): the unweighted count is 21,061 visits. Q2(b): summing the patient visit weight PATWT gives 136,943,181 estimated U.S. ED visits in 2015</w:t>
+      </w:r>
+      <w:r>
+        <w:rPr>
+          <w:b w:val="0"/>
+        </w:rPr>
+        <w:t>, the total NCHS reports (codebook p.28) and well above 100 million. The weights are uneven (117 to 42,002; the 10% of rows with the largest weights carry 28.7% of weighted visits), and the sample does not mirror the country: the Northeast is 20.4% of rows but 17.3% of weighted visits, the South 33.3% versus 37.8%. We therefore weight every total, share and rate. We report weighted point estimates only; we did not compute design-based standard errors (strata CSTRATM, clusters CPSUM), so small differences should not be over-read.</w:t>
       </w:r>
     </w:p>
     <w:p>
@@ -63,7 +81,19 @@
         <w:rPr>
           <w:b w:val="0"/>
         </w:rPr>
-        <w:t>Missing values are mostly not stored as blanks. A standard pandas NaN count flags 600 columns, but those are largely unused drug-category text fields. NCHS records missing answers as negative codes: -9 (blank), -8 (unknown) and -7 (not applicable), as defined item by item in the codebook (p.37 onward). Counting -9 and -8, 118 variables are more than 5% missing and 56 more than 20%. Among the variables we use, unimputed ethnicity is 24.2% blank (so we use the imputed ETHIM), pain score 29.5%, triage level 22.2%, wait time 15.2% (plus 3.4% not applicable because the patient was not seen by a provider), expected payer 8.7% and length of visit 7.0%. Intent (INTENT15) and hospital discharge status (HDSTAT) are asked only for injury visits and admitted patients, respectively, so their high missing shares are by design.</w:t>
+        <w:t xml:space="preserve">Missing values are mostly not stored as blanks. A standard pandas NaN count flags 600 columns, but those are largely unused drug-category text fields. NCHS records missing answers as negative codes: -9 (blank), -8 (unknown) and -7 (not applicable), as defined item by item in the codebook (p.37 onward). </w:t>
+      </w:r>
+      <w:r>
+        <w:rPr>
+          <w:b/>
+        </w:rPr>
+        <w:t>Q1(b): counting -9 and -8, 118 variables are more than 5% missing and 56 more than 20%. Among the variables we use, unimputed ethnicity is 24.2% blank, pain score 29.5%, triage level 22.2%, wait time 15.2% (plus 3.4% not applicable because the patient was not seen by a provider), expected payer 8.7% and length of visit 7.0%.</w:t>
+      </w:r>
+      <w:r>
+        <w:rPr>
+          <w:b w:val="0"/>
+        </w:rPr>
+        <w:t xml:space="preserve"> We therefore use the imputed ethnicity (ETHIM, 0% missing). Intent (INTENT15) and hospital discharge status (HDSTAT) are asked only for injury visits and admitted patients, respectively, so their high missing shares are by design.</w:t>
       </w:r>
     </w:p>
     <w:p>
@@ -989,7 +1019,7 @@
           <w:color w:val="1F3A5F"/>
           <w:sz w:val="18"/>
         </w:rPr>
-        <w:t>Table 2. Descriptive statistics, unweighted and weighted</w:t>
+        <w:t>Table 2. Answers to Q3(a)-(d): descriptive statistics, unweighted and weighted</w:t>
       </w:r>
     </w:p>
     <w:tbl>
@@ -1077,10 +1107,10 @@
             </w:pPr>
             <w:r>
               <w:rPr>
-                <w:b w:val="0"/>
+                <w:b/>
                 <w:sz w:val="17"/>
               </w:rPr>
-              <w:t>Age, mean / median (years; 93 = top-coded "93+")</w:t>
+              <w:t>Q3(a) Age, mean / median (years; 93 = top-coded "93+")</w:t>
             </w:r>
           </w:p>
         </w:tc>
@@ -1096,7 +1126,7 @@
             </w:pPr>
             <w:r>
               <w:rPr>
-                <w:b w:val="0"/>
+                <w:b/>
                 <w:sz w:val="17"/>
               </w:rPr>
               <w:t>37.6 / 34</w:t>
@@ -1115,7 +1145,7 @@
             </w:pPr>
             <w:r>
               <w:rPr>
-                <w:b w:val="0"/>
+                <w:b/>
                 <w:sz w:val="17"/>
               </w:rPr>
               <w:t>37.0 / 34</w:t>
@@ -1135,10 +1165,10 @@
             </w:pPr>
             <w:r>
               <w:rPr>
-                <w:b w:val="0"/>
+                <w:b/>
                 <w:sz w:val="17"/>
               </w:rPr>
-              <w:t>Female / Hispanic (imputed ETHIM)</w:t>
+              <w:t>Q3(b) Female / Hispanic (imputed ETHIM)</w:t>
             </w:r>
           </w:p>
         </w:tc>
@@ -1154,7 +1184,7 @@
             </w:pPr>
             <w:r>
               <w:rPr>
-                <w:b w:val="0"/>
+                <w:b/>
                 <w:sz w:val="17"/>
               </w:rPr>
               <w:t>55.1% / 15.9%</w:t>
@@ -1173,7 +1203,7 @@
             </w:pPr>
             <w:r>
               <w:rPr>
-                <w:b w:val="0"/>
+                <w:b/>
                 <w:sz w:val="17"/>
               </w:rPr>
               <w:t>55.4% / 16.5%</w:t>
@@ -1193,10 +1223,10 @@
             </w:pPr>
             <w:r>
               <w:rPr>
-                <w:b w:val="0"/>
+                <w:b/>
                 <w:sz w:val="17"/>
               </w:rPr>
-              <w:t>Wait to see a provider, median (n = 17,153 with recorded wait)</w:t>
+              <w:t>Q3(c) Wait to see a provider, median (n = 17,153 with recorded wait)</w:t>
             </w:r>
           </w:p>
         </w:tc>
@@ -1212,7 +1242,7 @@
             </w:pPr>
             <w:r>
               <w:rPr>
-                <w:b w:val="0"/>
+                <w:b/>
                 <w:sz w:val="17"/>
               </w:rPr>
               <w:t>19 min</w:t>
@@ -1231,7 +1261,7 @@
             </w:pPr>
             <w:r>
               <w:rPr>
-                <w:b w:val="0"/>
+                <w:b/>
                 <w:sz w:val="17"/>
               </w:rPr>
               <w:t>18 min</w:t>
@@ -1309,10 +1339,10 @@
             </w:pPr>
             <w:r>
               <w:rPr>
-                <w:b w:val="0"/>
+                <w:b/>
                 <w:sz w:val="17"/>
               </w:rPr>
-              <w:t>Length of visit, mean raw / winsorized (n = 19,581)</w:t>
+              <w:t>Q3(d) Length of visit, mean raw / winsorized (n = 19,581)</w:t>
             </w:r>
           </w:p>
         </w:tc>
@@ -1328,7 +1358,7 @@
             </w:pPr>
             <w:r>
               <w:rPr>
-                <w:b w:val="0"/>
+                <w:b/>
                 <w:sz w:val="17"/>
               </w:rPr>
               <w:t>221.9 / 216.5 min</w:t>
@@ -1347,7 +1377,7 @@
             </w:pPr>
             <w:r>
               <w:rPr>
-                <w:b w:val="0"/>
+                <w:b/>
                 <w:sz w:val="17"/>
               </w:rPr>
               <w:t>213.7 / 209.8 min</w:t>
@@ -1563,7 +1593,19 @@
         <w:rPr>
           <w:b w:val="0"/>
         </w:rPr>
-        <w:t>Because 2015 had 53 Thursdays and 52 of every other weekday, we compare days as average visits per day. Monday is the busiest day (432,000 visits per day) and Sunday the quietest (346,000), a 25% difference, with volume declining from Monday through Thursday. Over the year that is 22.45 million weighted Monday visits versus 18.00 million on Sundays. By hour, arrivals are lowest between 3am and 6am (about 1.3-1.4% of daily arrivals per hour), climb from 7am, and stay near their peak from 10am to 8pm; the busiest hour is 6pm (6.3%, 8.59 million arrivals over 2015). The peak hour receives 4.7 times as many arrivals as the quietest, and 69% of patients arrive between 10am and 10pm.</w:t>
+        <w:t xml:space="preserve">Because 2015 had 53 Thursdays and 52 of every other weekday, we compare days as average visits per day. </w:t>
+      </w:r>
+      <w:r>
+        <w:rPr>
+          <w:b/>
+        </w:rPr>
+        <w:t>Q4(a): over the year, weighted visits total 22.45 million on Mondays and 18.00 million on Sundays; Figure 1 shows every weekday and every arrival hour. Q4(b): Monday is the busiest day (432,000 visits per day) and Sunday the quietest (346,000), a 25% difference; the busiest hour is 6pm (6.3% of arrivals, 8.59 million over 2015), within a plateau from 10am to 8pm.</w:t>
+      </w:r>
+      <w:r>
+        <w:rPr>
+          <w:b w:val="0"/>
+        </w:rPr>
+        <w:t xml:space="preserve"> Volume declines from Monday through Thursday. Arrivals are lowest between 3am and 6am (about 1.3-1.4% of daily arrivals per hour) and climb from 7am; the peak hour receives 4.7 times as many arrivals as the quietest, and 69% of patients arrive between 10am and 10pm.</w:t>
       </w:r>
     </w:p>
     <w:p>
@@ -1587,7 +1629,19 @@
         <w:rPr>
           <w:b w:val="0"/>
         </w:rPr>
-        <w:t>PAYTYPER is the primary expected source of payment, chosen by an NCHS hierarchy when a visit lists several; it is not a record of revenue actually collected. Across all visits (weighted), Medicaid/CHIP is the expected payer for 31.2%, private insurance 27.6%, Medicare 17.7% and self-pay 9.0%, other 2.2%, no charge 0.8% and workers' compensation 0.7%; for a further 10.8% the payer is blank or unknown. Medicaid and Medicare together account for 48.9% of all visits and 54.8% of the 89.2% of visits with a known expected payer (Medicaid 34.9%, private 30.9%, Medicare 19.9%, self-pay 10.1%; self-pay and no charge together 11.0%). Age drives much of this mix (Figure 2): Medicaid is the expected payer for 65% of visits by children, Medicare for 78-87% of visits by patients 65 and older, and self-pay peaks at 17.5% among 25-44-year-olds.</w:t>
+        <w:t xml:space="preserve">PAYTYPER is the primary expected source of payment, chosen by an NCHS hierarchy when a visit lists several; it is not a record of revenue actually collected. </w:t>
+      </w:r>
+      <w:r>
+        <w:rPr>
+          <w:b/>
+        </w:rPr>
+        <w:t>Q5(a): across all visits (weighted), Medicaid/CHIP is the expected payer for 31.2%, private insurance 27.6%, Medicare 17.7%, self-pay 9.0%, other 2.2%, no charge 0.8% and workers' compensation 0.7%; for a further 10.8% the payer is blank or unknown. Q5(b): among the 89.2% of visits with a known expected payer, Medicaid is 34.9%, private insurance 30.9%, Medicare 19.9% and self-pay 10.1%; Medicaid and Medicare together are 54.8% of known-payer visits and 48.9% of all visits.</w:t>
+      </w:r>
+      <w:r>
+        <w:rPr>
+          <w:b w:val="0"/>
+        </w:rPr>
+        <w:t xml:space="preserve"> Self-pay and no charge together are 11.0% of known-payer visits. Age drives much of this mix (Figure 2): Medicaid is the expected payer for 65% of visits by children, Medicare for 78-87% of visits by patients 65 and older, and self-pay peaks at 17.5% among 25-44-year-olds.</w:t>
       </w:r>
     </w:p>
     <w:p>
@@ -1723,13 +1777,25 @@
         <w:rPr>
           <w:b/>
         </w:rPr>
-        <w:t>Chronic conditions (Q6).</w:t>
+        <w:t>Chronic conditions (Q6). Q6(a): among visits with the chronic-condition section completed (1.6% of records were blank), 47.6% record at least one chronic condition</w:t>
       </w:r>
       <w:r>
         <w:rPr>
           <w:b w:val="0"/>
         </w:rPr>
-        <w:t xml:space="preserve"> Among visits with the chronic-condition section completed (1.6% of records were blank), 47.6% record at least one chronic condition (weighted; 48.5% unweighted) and 14.9% record three or more. Hypertension is the most common (24.0%). Diabetes is split across three checkboxes (type 1, type 2 and unspecified); counting any of them, 11.1% of visits record diabetes, making it second, whereas type 2 alone is 4.7%. Asthma (10.0%) and depression (9.5%) follow; obesity (3.6%) likely understates true prevalence because it depends on documentation. The share with a chronic condition rises from 13% of visits by children under 15 to 90% at 75 and older. These flags describe patients' conditions, not the reason for the visit, so they do not show whether visits were flare-ups or avoidable. They do show that ED clinicians routinely treat patients whose chronic illness can complicate care; whether better coordination would change ED use is a question these data cannot answer.</w:t>
+        <w:t xml:space="preserve"> (weighted; 48.5% unweighted), and 14.9% record three or more. </w:t>
+      </w:r>
+      <w:r>
+        <w:rPr>
+          <w:b/>
+        </w:rPr>
+        <w:t>Q6(b): hypertension is the most prevalent (24.0%); of the other conditions named in the assignment, depression is 9.5%, type 2 diabetes 4.7% and obesity 3.6%.</w:t>
+      </w:r>
+      <w:r>
+        <w:rPr>
+          <w:b w:val="0"/>
+        </w:rPr>
+        <w:t xml:space="preserve"> Diabetes is split across three checkboxes (type 1, type 2 and unspecified); counting any of them, 11.1% of visits record diabetes, making it second, ahead of asthma (10.0%). Obesity likely understates true prevalence because it depends on documentation. The share with a chronic condition rises from 13% of visits by children under 15 to 90% at 75 and older. These flags describe patients' conditions, not the reason for the visit, so they do not show whether visits were flare-ups or avoidable, only that ED clinicians routinely treat chronically ill patients.</w:t>
       </w:r>
     </w:p>
     <w:p>
@@ -1737,13 +1803,25 @@
         <w:rPr>
           <w:b/>
         </w:rPr>
-        <w:t>Injuries (Q7).</w:t>
+        <w:t>Injuries (Q7). Q7(a): 33.1% of visits (weighted) are related to an injury (29.5%), an overdose or poisoning (1.4%) or an adverse effect of medical care (2.2%).</w:t>
       </w:r>
       <w:r>
         <w:rPr>
           <w:b w:val="0"/>
         </w:rPr>
-        <w:t xml:space="preserve"> In all, 33.1% of visits (weighted) are coded as related to an injury (29.5%), an overdose or poisoning (1.4%) or an adverse effect of medical care (2.2%). Intent is recorded only for injuries and overdoses, and about a quarter of this combined group (25.7%, including every adverse-effect visit) has no intent recorded. Among visits with known intent, 7.3% are intentional and 92.7% unintentional. Overdoses and poisonings are more often recorded as intentional (13.2%), and among visits with known intent the intentional share is highest at ages 15-24 (12.1%).</w:t>
+        <w:t xml:space="preserve"> Intent is recorded only for injuries and overdoses, and about a quarter of this combined group (25.7%, including every adverse-effect visit) has no intent recorded. </w:t>
+      </w:r>
+      <w:r>
+        <w:rPr>
+          <w:b/>
+        </w:rPr>
+        <w:t>Q7(b): among visits with known intent, 7.3% are intentional and 92.7% unintentional.</w:t>
+      </w:r>
+      <w:r>
+        <w:rPr>
+          <w:b w:val="0"/>
+        </w:rPr>
+        <w:t xml:space="preserve"> Overdoses and poisonings are more often recorded as intentional (13.2%), and among visits with known intent the intentional share is highest at ages 15-24 (12.1%).</w:t>
       </w:r>
     </w:p>
     <w:p>
@@ -1751,13 +1829,25 @@
         <w:rPr>
           <w:b/>
         </w:rPr>
-        <w:t>Diagnostic services (Q8).</w:t>
+        <w:t>Diagnostic services (Q8). Q8(a): imaging is used at 47.0% of all visits (weighted)</w:t>
       </w:r>
       <w:r>
         <w:rPr>
           <w:b w:val="0"/>
         </w:rPr>
-        <w:t xml:space="preserve"> Imaging is used at 47.0% of all visits (weighted): X-ray 33.7%, CT 16.5%, ultrasound 4.4% and MRI 0.7%. Use rises with age, from 29% of visits by children to 70% at 75 and older, and is higher for injury visits (54%) than other visits (44%). At least one blood test is ordered at 42.4% of visits. Among those visits, a complete blood count is by far the most common test (85.4%), followed by the comprehensive (55.3%) and basic (25.2%) metabolic panels, with 3.2 different tests per visit on average. Standalone glucose, BUN/creatinine and electrolyte orders are less common partly because the panels include those tests (codebook pp.3-4).</w:t>
+        <w:t xml:space="preserve">: X-ray 33.7%, CT 16.5%, ultrasound 4.4% and MRI 0.7%. Use rises with age, from 29% of visits by children to 70% at 75 and older, and is higher for injury visits (54%) than other visits (44%). At least one blood test is ordered at 42.4% of visits. </w:t>
+      </w:r>
+      <w:r>
+        <w:rPr>
+          <w:b/>
+        </w:rPr>
+        <w:t>Q8(b): among those visits, a complete blood count is by far the most frequently ordered test (85.4%), followed by the comprehensive (55.3%) and basic (25.2%) metabolic panels</w:t>
+      </w:r>
+      <w:r>
+        <w:rPr>
+          <w:b w:val="0"/>
+        </w:rPr>
+        <w:t>, with 3.2 different tests per visit on average (the panels already include glucose and electrolytes).</w:t>
       </w:r>
     </w:p>
     <w:p>
@@ -1768,13 +1858,13 @@
         <w:rPr>
           <w:b/>
         </w:rPr>
-        <w:t>Medications (Q9).</w:t>
+        <w:t>Medications (Q9). Q9(a): the weighted mean is 2.49 medications per visit and the median is 2. Q9(b): 20.9% of visits involve none, 41.9% one or two and 37.2% three or more</w:t>
       </w:r>
       <w:r>
         <w:rPr>
           <w:b w:val="0"/>
         </w:rPr>
-        <w:t xml:space="preserve"> The weighted mean is 2.49 medications per visit and the median is 2; 20.9% of visits involve none, 41.9% one or two and 37.2% three or more, matching NCHS (Table 1). On average 1.62 are given in the ED and 1.08 prescribed at discharge (a drug can be both, so these overlap). The count rises with complexity, from 2.0 with no recorded chronic condition to 3.8 with three or more, and peaks at 3.1 for ages 45-64, so medication reconciliation and interaction checking are routine ED work.</w:t>
+        <w:t>, matching NCHS (Table 1). On average 1.62 are given in the ED and 1.08 prescribed at discharge (a drug can be both, so these overlap). The count rises with complexity, from 2.0 with no recorded chronic condition to 3.8 with three or more, and peaks at 3.1 for ages 45-64, so medication reconciliation and interaction checking are routine ED work.</w:t>
       </w:r>
     </w:p>
     <w:p>
@@ -1790,7 +1880,19 @@
         <w:rPr>
           <w:b w:val="0"/>
         </w:rPr>
-        <w:t>We built about 20 cleaned variables (missing codes removed, wait and length of visit winsorized) and computed weighted Pearson correlations, each using the visits where both variables are present. Triage level runs from 1 (immediate) to 5 (nonurgent), so a negative correlation means more of something among more urgent patients. The correlations describe associations, not causal effects.</w:t>
+        <w:t xml:space="preserve">We built about 20 cleaned variables (missing codes removed, wait and length of visit winsorized) and computed weighted Pearson correlations, each using the visits where both variables are present. Triage level runs from 1 (immediate) to 5 (nonurgent), so a negative correlation means more of something among more urgent patients. </w:t>
+      </w:r>
+      <w:r>
+        <w:rPr>
+          <w:b/>
+        </w:rPr>
+        <w:t>Q10: the strongest associations link age, chronic conditions and Medicare; testing intensity and chronic conditions are the strongest correlates of admission (r = 0.37 and 0.33); sex, ethnicity and pain score show little association with outcomes (Table 3).</w:t>
+      </w:r>
+      <w:r>
+        <w:rPr>
+          <w:b w:val="0"/>
+        </w:rPr>
+        <w:t xml:space="preserve"> The correlations describe associations, not causal effects.</w:t>
       </w:r>
     </w:p>
     <w:p>
@@ -1804,7 +1906,7 @@
           <w:color w:val="1F3A5F"/>
           <w:sz w:val="18"/>
         </w:rPr>
-        <w:t>Table 3. Selected weighted correlations</w:t>
+        <w:t>Table 3. Answer to Q10: selected weighted correlations</w:t>
       </w:r>
     </w:p>
     <w:tbl>
@@ -2404,7 +2506,7 @@
       <w:r>
         <w:drawing>
           <wp:inline xmlns:a="http://schemas.openxmlformats.org/drawingml/2006/main" xmlns:pic="http://schemas.openxmlformats.org/drawingml/2006/picture">
-            <wp:extent cx="4846320" cy="1615440"/>
+            <wp:extent cx="4480560" cy="1493520"/>
             <wp:docPr id="5" name="Picture 5"/>
             <wp:cNvGraphicFramePr>
               <a:graphicFrameLocks noChangeAspect="1"/>
@@ -2425,7 +2527,7 @@
                   <pic:spPr>
                     <a:xfrm>
                       <a:off x="0" y="0"/>
-                      <a:ext cx="4846320" cy="1615440"/>
+                      <a:ext cx="4480560" cy="1493520"/>
                     </a:xfrm>
                     <a:prstGeom prst="rect"/>
                   </pic:spPr>
@@ -2476,19 +2578,7 @@
         <w:rPr>
           <w:b w:val="0"/>
         </w:rPr>
-        <w:t>Capacity: arrivals hold near peak from 10am to 8pm and run about 25% higher on Mondays than Sundays, and the median visit lasts 2.6 hours, so time in the department is as important a planning variable as arrival volume.</w:t>
-      </w:r>
-    </w:p>
-    <w:p>
-      <w:pPr>
-        <w:pStyle w:val="ListBullet"/>
-        <w:spacing w:after="40"/>
-      </w:pPr>
-      <w:r>
-        <w:rPr>
-          <w:b w:val="0"/>
-        </w:rPr>
-        <w:t>Patient flow: recorded median waits for emergent (level 2) patients match those for nonurgent patients, a pattern worth checking against local timestamp data.</w:t>
+        <w:t>Capacity and flow: plan for a 10am-8pm plateau and a Monday excess, treat time in the department (median 2.6 hours) as a planning variable, and check locally why emergent and nonurgent patients have the same recorded median wait.</w:t>
       </w:r>
     </w:p>
     <w:p>
@@ -2512,7 +2602,7 @@
         <w:rPr>
           <w:b w:val="0"/>
         </w:rPr>
-        <w:t>Limitations: no design-based standard errors; wait-time missingness varies by triage status and region; rare outcomes fall below NCHS's reliability threshold; condition flags depend on documentation; and 2015 form changes limit comparisons with earlier years.</w:t>
+        <w:t>Limitations: no design-based standard errors; wait-time missingness varies by triage status and region; rare outcomes fall below NCHS's reliability threshold; condition flags depend on documentation.</w:t>
       </w:r>
     </w:p>
     <w:p>

</xml_diff>